<commit_message>
Day-> 22 ready for printing
</commit_message>
<xml_diff>
--- a/Received/four/4 English.docx
+++ b/Received/four/4 English.docx
@@ -1168,15 +1168,6 @@
           <w:lang w:val="en-US" w:bidi="ar-SA"/>
         </w:rPr>
         <w:tab/>
-      </w:r>
-      <w:r>
-        <w:rPr>
-          <w:rFonts w:ascii="Times New Roman" w:eastAsia="Times New Roman" w:hAnsi="Times New Roman" w:cs="Times New Roman"/>
-          <w:b/>
-          <w:sz w:val="28"/>
-          <w:szCs w:val="28"/>
-          <w:lang w:val="en-US" w:bidi="ar-SA"/>
-        </w:rPr>
         <w:t>(5×1=5)</w:t>
       </w:r>
       <w:r>
@@ -1624,6 +1615,237 @@
           <w:lang w:val="en-US" w:bidi="ar-SA"/>
         </w:rPr>
         <w:lastRenderedPageBreak/>
+        <w:t xml:space="preserve">B. Answer the following questions. </w:t>
+      </w:r>
+      <w:r>
+        <w:rPr>
+          <w:rFonts w:ascii="Times New Roman" w:eastAsia="Times New Roman" w:hAnsi="Times New Roman" w:cs="Times New Roman"/>
+          <w:b/>
+          <w:sz w:val="28"/>
+          <w:szCs w:val="28"/>
+          <w:lang w:val="en-US" w:bidi="ar-SA"/>
+        </w:rPr>
+        <w:tab/>
+      </w:r>
+      <w:r>
+        <w:rPr>
+          <w:rFonts w:ascii="Times New Roman" w:eastAsia="Times New Roman" w:hAnsi="Times New Roman" w:cs="Times New Roman"/>
+          <w:b/>
+          <w:sz w:val="28"/>
+          <w:szCs w:val="28"/>
+          <w:lang w:val="en-US" w:bidi="ar-SA"/>
+        </w:rPr>
+        <w:tab/>
+      </w:r>
+      <w:r>
+        <w:rPr>
+          <w:rFonts w:ascii="Times New Roman" w:eastAsia="Times New Roman" w:hAnsi="Times New Roman" w:cs="Times New Roman"/>
+          <w:b/>
+          <w:sz w:val="28"/>
+          <w:szCs w:val="28"/>
+          <w:lang w:val="en-US" w:bidi="ar-SA"/>
+        </w:rPr>
+        <w:tab/>
+      </w:r>
+      <w:r>
+        <w:rPr>
+          <w:rFonts w:ascii="Times New Roman" w:eastAsia="Times New Roman" w:hAnsi="Times New Roman" w:cs="Times New Roman"/>
+          <w:b/>
+          <w:sz w:val="28"/>
+          <w:szCs w:val="28"/>
+          <w:lang w:val="en-US" w:bidi="ar-SA"/>
+        </w:rPr>
+        <w:t>(5×1=5)</w:t>
+      </w:r>
+      <w:r>
+        <w:rPr>
+          <w:rFonts w:ascii="Times New Roman" w:eastAsia="Times New Roman" w:hAnsi="Times New Roman" w:cs="Times New Roman"/>
+          <w:b/>
+          <w:sz w:val="28"/>
+          <w:szCs w:val="28"/>
+          <w:lang w:val="en-US" w:bidi="ar-SA"/>
+        </w:rPr>
+        <w:t> </w:t>
+      </w:r>
+    </w:p>
+    <w:p>
+      <w:pPr>
+        <w:spacing w:after="0" w:line="240" w:lineRule="auto"/>
+        <w:jc w:val="both"/>
+        <w:rPr>
+          <w:rFonts w:ascii="Times New Roman" w:eastAsia="Times New Roman" w:hAnsi="Times New Roman" w:cs="Times New Roman"/>
+          <w:bCs/>
+          <w:sz w:val="28"/>
+          <w:szCs w:val="28"/>
+          <w:lang w:val="en-US" w:bidi="ar-SA"/>
+        </w:rPr>
+      </w:pPr>
+      <w:r>
+        <w:rPr>
+          <w:rFonts w:ascii="Times New Roman" w:eastAsia="Times New Roman" w:hAnsi="Times New Roman" w:cs="Times New Roman"/>
+          <w:bCs/>
+          <w:sz w:val="28"/>
+          <w:szCs w:val="28"/>
+          <w:lang w:val="en-US" w:bidi="ar-SA"/>
+        </w:rPr>
+        <w:t xml:space="preserve">i. </w:t>
+      </w:r>
+      <w:r>
+        <w:rPr>
+          <w:rFonts w:ascii="Times New Roman" w:eastAsia="Times New Roman" w:hAnsi="Times New Roman" w:cs="Times New Roman"/>
+          <w:bCs/>
+          <w:sz w:val="28"/>
+          <w:szCs w:val="28"/>
+          <w:lang w:val="en-US" w:bidi="ar-SA"/>
+        </w:rPr>
+        <w:t>Whose birthday was celebrated in the story?</w:t>
+      </w:r>
+    </w:p>
+    <w:p>
+      <w:pPr>
+        <w:spacing w:after="0" w:line="240" w:lineRule="auto"/>
+        <w:jc w:val="both"/>
+        <w:rPr>
+          <w:rFonts w:ascii="Times New Roman" w:eastAsia="Times New Roman" w:hAnsi="Times New Roman" w:cs="Times New Roman"/>
+          <w:bCs/>
+          <w:sz w:val="28"/>
+          <w:szCs w:val="28"/>
+          <w:lang w:val="en-US" w:bidi="ar-SA"/>
+        </w:rPr>
+      </w:pPr>
+      <w:r>
+        <w:rPr>
+          <w:rFonts w:ascii="Times New Roman" w:eastAsia="Times New Roman" w:hAnsi="Times New Roman" w:cs="Times New Roman"/>
+          <w:bCs/>
+          <w:sz w:val="28"/>
+          <w:szCs w:val="28"/>
+          <w:lang w:val="en-US" w:bidi="ar-SA"/>
+        </w:rPr>
+        <w:t>ii. Who arranged the birthday party?</w:t>
+      </w:r>
+    </w:p>
+    <w:p>
+      <w:pPr>
+        <w:spacing w:after="0" w:line="240" w:lineRule="auto"/>
+        <w:jc w:val="both"/>
+        <w:rPr>
+          <w:rFonts w:ascii="Times New Roman" w:eastAsia="Times New Roman" w:hAnsi="Times New Roman" w:cs="Times New Roman"/>
+          <w:bCs/>
+          <w:sz w:val="28"/>
+          <w:szCs w:val="28"/>
+          <w:lang w:val="en-US" w:bidi="ar-SA"/>
+        </w:rPr>
+      </w:pPr>
+      <w:r>
+        <w:rPr>
+          <w:rFonts w:ascii="Times New Roman" w:eastAsia="Times New Roman" w:hAnsi="Times New Roman" w:cs="Times New Roman"/>
+          <w:bCs/>
+          <w:sz w:val="28"/>
+          <w:szCs w:val="28"/>
+          <w:lang w:val="en-US" w:bidi="ar-SA"/>
+        </w:rPr>
+        <w:t>iii. How did the cake paste?</w:t>
+      </w:r>
+    </w:p>
+    <w:p>
+      <w:pPr>
+        <w:spacing w:after="0" w:line="240" w:lineRule="auto"/>
+        <w:jc w:val="both"/>
+        <w:rPr>
+          <w:rFonts w:ascii="Times New Roman" w:eastAsia="Times New Roman" w:hAnsi="Times New Roman" w:cs="Times New Roman"/>
+          <w:bCs/>
+          <w:sz w:val="28"/>
+          <w:szCs w:val="28"/>
+          <w:lang w:val="en-US" w:bidi="ar-SA"/>
+        </w:rPr>
+      </w:pPr>
+      <w:r>
+        <w:rPr>
+          <w:rFonts w:ascii="Times New Roman" w:eastAsia="Times New Roman" w:hAnsi="Times New Roman" w:cs="Times New Roman"/>
+          <w:bCs/>
+          <w:sz w:val="28"/>
+          <w:szCs w:val="28"/>
+          <w:lang w:val="en-US" w:bidi="ar-SA"/>
+        </w:rPr>
+        <w:t>iv. Who came with Mama to the party?</w:t>
+      </w:r>
+    </w:p>
+    <w:p>
+      <w:pPr>
+        <w:spacing w:after="0" w:line="240" w:lineRule="auto"/>
+        <w:jc w:val="both"/>
+        <w:rPr>
+          <w:rFonts w:ascii="Times New Roman" w:eastAsia="Times New Roman" w:hAnsi="Times New Roman" w:cs="Times New Roman"/>
+          <w:bCs/>
+          <w:sz w:val="28"/>
+          <w:szCs w:val="28"/>
+          <w:lang w:val="en-US" w:bidi="ar-SA"/>
+        </w:rPr>
+      </w:pPr>
+      <w:r>
+        <w:rPr>
+          <w:rFonts w:ascii="Times New Roman" w:eastAsia="Times New Roman" w:hAnsi="Times New Roman" w:cs="Times New Roman"/>
+          <w:bCs/>
+          <w:sz w:val="28"/>
+          <w:szCs w:val="28"/>
+          <w:lang w:val="en-US" w:bidi="ar-SA"/>
+        </w:rPr>
+        <w:t xml:space="preserve">v. What did Salman Khan do while wishing </w:t>
+      </w:r>
+      <w:r>
+        <w:rPr>
+          <w:rFonts w:ascii="Times New Roman" w:eastAsia="Times New Roman" w:hAnsi="Times New Roman" w:cs="Times New Roman"/>
+          <w:bCs/>
+          <w:sz w:val="28"/>
+          <w:szCs w:val="28"/>
+          <w:lang w:val="en-US" w:bidi="ar-SA"/>
+        </w:rPr>
+        <w:t>Kanchan</w:t>
+      </w:r>
+      <w:r>
+        <w:rPr>
+          <w:rFonts w:ascii="Times New Roman" w:eastAsia="Times New Roman" w:hAnsi="Times New Roman" w:cs="Times New Roman"/>
+          <w:bCs/>
+          <w:sz w:val="28"/>
+          <w:szCs w:val="28"/>
+          <w:lang w:val="en-US" w:bidi="ar-SA"/>
+        </w:rPr>
+        <w:t>?</w:t>
+      </w:r>
+    </w:p>
+    <w:p>
+      <w:pPr>
+        <w:spacing w:after="0" w:line="240" w:lineRule="auto"/>
+        <w:jc w:val="both"/>
+        <w:rPr>
+          <w:rFonts w:ascii="Times New Roman" w:eastAsia="Times New Roman" w:hAnsi="Times New Roman" w:cs="Times New Roman"/>
+          <w:b/>
+          <w:sz w:val="28"/>
+          <w:szCs w:val="28"/>
+          <w:lang w:val="en-US" w:bidi="ar-SA"/>
+        </w:rPr>
+      </w:pPr>
+    </w:p>
+    <w:p>
+      <w:pPr>
+        <w:spacing w:after="0" w:line="240" w:lineRule="auto"/>
+        <w:jc w:val="both"/>
+        <w:rPr>
+          <w:rFonts w:ascii="Times New Roman" w:eastAsia="Times New Roman" w:hAnsi="Times New Roman" w:cs="Times New Roman"/>
+          <w:b/>
+          <w:sz w:val="28"/>
+          <w:szCs w:val="28"/>
+          <w:lang w:val="en-US" w:bidi="ar-SA"/>
+        </w:rPr>
+      </w:pPr>
+      <w:r>
+        <w:rPr>
+          <w:rFonts w:ascii="Times New Roman" w:eastAsia="Times New Roman" w:hAnsi="Times New Roman" w:cs="Times New Roman"/>
+          <w:b/>
+          <w:sz w:val="28"/>
+          <w:szCs w:val="28"/>
+          <w:lang w:val="en-US" w:bidi="ar-SA"/>
+        </w:rPr>
         <w:t>4</w:t>
       </w:r>
       <w:r>
@@ -1794,6 +2016,60 @@
         </w:rPr>
         <w:t>i. to the friend</w:t>
       </w:r>
+      <w:r>
+        <w:rPr>
+          <w:rFonts w:ascii="Times New Roman" w:eastAsia="Times New Roman" w:hAnsi="Times New Roman" w:cs="Times New Roman"/>
+          <w:sz w:val="28"/>
+          <w:szCs w:val="28"/>
+          <w:lang w:val="en-US" w:bidi="ar-SA"/>
+        </w:rPr>
+        <w:tab/>
+      </w:r>
+      <w:r>
+        <w:rPr>
+          <w:rFonts w:ascii="Times New Roman" w:eastAsia="Times New Roman" w:hAnsi="Times New Roman" w:cs="Times New Roman"/>
+          <w:sz w:val="28"/>
+          <w:szCs w:val="28"/>
+          <w:lang w:val="en-US" w:bidi="ar-SA"/>
+        </w:rPr>
+        <w:t xml:space="preserve">    ii</w:t>
+      </w:r>
+      <w:r>
+        <w:rPr>
+          <w:rFonts w:ascii="Times New Roman" w:eastAsia="Times New Roman" w:hAnsi="Times New Roman" w:cs="Times New Roman"/>
+          <w:sz w:val="28"/>
+          <w:szCs w:val="28"/>
+          <w:lang w:val="en-US" w:bidi="ar-SA"/>
+        </w:rPr>
+        <w:t>. Hari</w:t>
+      </w:r>
+      <w:r>
+        <w:rPr>
+          <w:rFonts w:ascii="Times New Roman" w:eastAsia="Times New Roman" w:hAnsi="Times New Roman" w:cs="Times New Roman"/>
+          <w:sz w:val="28"/>
+          <w:szCs w:val="28"/>
+          <w:lang w:val="en-US" w:bidi="ar-SA"/>
+        </w:rPr>
+        <w:tab/>
+      </w:r>
+      <w:r>
+        <w:rPr>
+          <w:rFonts w:ascii="Times New Roman" w:eastAsia="Times New Roman" w:hAnsi="Times New Roman" w:cs="Times New Roman"/>
+          <w:sz w:val="28"/>
+          <w:szCs w:val="28"/>
+          <w:lang w:val="en-US" w:bidi="ar-SA"/>
+        </w:rPr>
+        <w:t xml:space="preserve">     </w:t>
+      </w:r>
+      <w:r>
+        <w:rPr>
+          <w:rFonts w:ascii="Times New Roman" w:eastAsia="Times New Roman" w:hAnsi="Times New Roman" w:cs="Times New Roman"/>
+          <w:sz w:val="28"/>
+          <w:szCs w:val="28"/>
+          <w:lang w:val="en-US" w:bidi="ar-SA"/>
+        </w:rPr>
+        <w:t>iii. himself</w:t>
+      </w:r>
     </w:p>
     <w:p>
       <w:pPr>
@@ -1814,16 +2090,7 @@
           <w:szCs w:val="28"/>
           <w:lang w:val="en-US" w:bidi="ar-SA"/>
         </w:rPr>
-        <w:t xml:space="preserve">     ii</w:t>
-      </w:r>
-      <w:r>
-        <w:rPr>
-          <w:rFonts w:ascii="Times New Roman" w:eastAsia="Times New Roman" w:hAnsi="Times New Roman" w:cs="Times New Roman"/>
-          <w:sz w:val="28"/>
-          <w:szCs w:val="28"/>
-          <w:lang w:val="en-US" w:bidi="ar-SA"/>
-        </w:rPr>
-        <w:t>. Hari</w:t>
+        <w:t>b) What is the text about?</w:t>
       </w:r>
     </w:p>
     <w:p>
@@ -1854,7 +2121,25 @@
           <w:szCs w:val="28"/>
           <w:lang w:val="en-US" w:bidi="ar-SA"/>
         </w:rPr>
-        <w:t>iii. himself</w:t>
+        <w:t>i. Thanking message</w:t>
+      </w:r>
+      <w:r>
+        <w:rPr>
+          <w:rFonts w:ascii="Times New Roman" w:eastAsia="Times New Roman" w:hAnsi="Times New Roman" w:cs="Times New Roman"/>
+          <w:sz w:val="28"/>
+          <w:szCs w:val="28"/>
+          <w:lang w:val="en-US" w:bidi="ar-SA"/>
+        </w:rPr>
+        <w:t xml:space="preserve">     </w:t>
+      </w:r>
+      <w:r>
+        <w:rPr>
+          <w:rFonts w:ascii="Times New Roman" w:eastAsia="Times New Roman" w:hAnsi="Times New Roman" w:cs="Times New Roman"/>
+          <w:sz w:val="28"/>
+          <w:szCs w:val="28"/>
+          <w:lang w:val="en-US" w:bidi="ar-SA"/>
+        </w:rPr>
+        <w:t>ii. Congratulation message</w:t>
       </w:r>
     </w:p>
     <w:p>
@@ -1876,7 +2161,25 @@
           <w:szCs w:val="28"/>
           <w:lang w:val="en-US" w:bidi="ar-SA"/>
         </w:rPr>
-        <w:t>b) What is the text about?</w:t>
+        <w:t xml:space="preserve">     </w:t>
+      </w:r>
+      <w:r>
+        <w:rPr>
+          <w:rFonts w:ascii="Times New Roman" w:eastAsia="Times New Roman" w:hAnsi="Times New Roman" w:cs="Times New Roman"/>
+          <w:sz w:val="28"/>
+          <w:szCs w:val="28"/>
+          <w:lang w:val="en-US" w:bidi="ar-SA"/>
+        </w:rPr>
+        <w:t>iii. speech competition</w:t>
+      </w:r>
+      <w:r>
+        <w:rPr>
+          <w:rFonts w:ascii="Times New Roman" w:eastAsia="Times New Roman" w:hAnsi="Times New Roman" w:cs="Times New Roman"/>
+          <w:sz w:val="28"/>
+          <w:szCs w:val="28"/>
+          <w:lang w:val="en-US" w:bidi="ar-SA"/>
+        </w:rPr>
+        <w:t xml:space="preserve"> </w:t>
       </w:r>
     </w:p>
     <w:p>
@@ -1898,6 +2201,28 @@
           <w:szCs w:val="28"/>
           <w:lang w:val="en-US" w:bidi="ar-SA"/>
         </w:rPr>
+        <w:t>c) How were the other participants?</w:t>
+      </w:r>
+    </w:p>
+    <w:p>
+      <w:pPr>
+        <w:spacing w:after="0" w:line="240" w:lineRule="auto"/>
+        <w:ind w:left="288"/>
+        <w:jc w:val="both"/>
+        <w:rPr>
+          <w:rFonts w:ascii="Times New Roman" w:eastAsia="Times New Roman" w:hAnsi="Times New Roman" w:cs="Times New Roman"/>
+          <w:sz w:val="28"/>
+          <w:szCs w:val="28"/>
+          <w:lang w:val="en-US" w:bidi="ar-SA"/>
+        </w:rPr>
+      </w:pPr>
+      <w:r>
+        <w:rPr>
+          <w:rFonts w:ascii="Times New Roman" w:eastAsia="Times New Roman" w:hAnsi="Times New Roman" w:cs="Times New Roman"/>
+          <w:sz w:val="28"/>
+          <w:szCs w:val="28"/>
+          <w:lang w:val="en-US" w:bidi="ar-SA"/>
+        </w:rPr>
         <w:t xml:space="preserve">     </w:t>
       </w:r>
       <w:r>
@@ -1907,7 +2232,97 @@
           <w:szCs w:val="28"/>
           <w:lang w:val="en-US" w:bidi="ar-SA"/>
         </w:rPr>
-        <w:t>i. Thanking message</w:t>
+        <w:t>i. fearless</w:t>
+      </w:r>
+      <w:r>
+        <w:rPr>
+          <w:rFonts w:ascii="Times New Roman" w:eastAsia="Times New Roman" w:hAnsi="Times New Roman" w:cs="Times New Roman"/>
+          <w:sz w:val="28"/>
+          <w:szCs w:val="28"/>
+          <w:lang w:val="en-US" w:bidi="ar-SA"/>
+        </w:rPr>
+        <w:tab/>
+      </w:r>
+      <w:r>
+        <w:rPr>
+          <w:rFonts w:ascii="Times New Roman" w:eastAsia="Times New Roman" w:hAnsi="Times New Roman" w:cs="Times New Roman"/>
+          <w:sz w:val="28"/>
+          <w:szCs w:val="28"/>
+          <w:lang w:val="en-US" w:bidi="ar-SA"/>
+        </w:rPr>
+        <w:t xml:space="preserve">     </w:t>
+      </w:r>
+      <w:r>
+        <w:rPr>
+          <w:rFonts w:ascii="Times New Roman" w:eastAsia="Times New Roman" w:hAnsi="Times New Roman" w:cs="Times New Roman"/>
+          <w:sz w:val="28"/>
+          <w:szCs w:val="28"/>
+          <w:lang w:val="en-US" w:bidi="ar-SA"/>
+        </w:rPr>
+        <w:t>ii. dull</w:t>
+      </w:r>
+      <w:r>
+        <w:rPr>
+          <w:rFonts w:ascii="Times New Roman" w:eastAsia="Times New Roman" w:hAnsi="Times New Roman" w:cs="Times New Roman"/>
+          <w:sz w:val="28"/>
+          <w:szCs w:val="28"/>
+          <w:lang w:val="en-US" w:bidi="ar-SA"/>
+        </w:rPr>
+        <w:tab/>
+      </w:r>
+      <w:r>
+        <w:rPr>
+          <w:rFonts w:ascii="Times New Roman" w:eastAsia="Times New Roman" w:hAnsi="Times New Roman" w:cs="Times New Roman"/>
+          <w:sz w:val="28"/>
+          <w:szCs w:val="28"/>
+          <w:lang w:val="en-US" w:bidi="ar-SA"/>
+        </w:rPr>
+        <w:t xml:space="preserve">     </w:t>
+      </w:r>
+      <w:r>
+        <w:rPr>
+          <w:rFonts w:ascii="Times New Roman" w:eastAsia="Times New Roman" w:hAnsi="Times New Roman" w:cs="Times New Roman"/>
+          <w:sz w:val="28"/>
+          <w:szCs w:val="28"/>
+          <w:lang w:val="en-US" w:bidi="ar-SA"/>
+        </w:rPr>
+        <w:tab/>
+      </w:r>
+      <w:r>
+        <w:rPr>
+          <w:rFonts w:ascii="Times New Roman" w:eastAsia="Times New Roman" w:hAnsi="Times New Roman" w:cs="Times New Roman"/>
+          <w:sz w:val="28"/>
+          <w:szCs w:val="28"/>
+          <w:lang w:val="en-US" w:bidi="ar-SA"/>
+        </w:rPr>
+        <w:tab/>
+      </w:r>
+      <w:r>
+        <w:rPr>
+          <w:rFonts w:ascii="Times New Roman" w:eastAsia="Times New Roman" w:hAnsi="Times New Roman" w:cs="Times New Roman"/>
+          <w:sz w:val="28"/>
+          <w:szCs w:val="28"/>
+          <w:lang w:val="en-US" w:bidi="ar-SA"/>
+        </w:rPr>
+        <w:t>iii.</w:t>
+      </w:r>
+      <w:r>
+        <w:rPr>
+          <w:rFonts w:ascii="Times New Roman" w:eastAsia="Times New Roman" w:hAnsi="Times New Roman" w:cs="Times New Roman"/>
+          <w:sz w:val="28"/>
+          <w:szCs w:val="28"/>
+          <w:lang w:val="en-US" w:bidi="ar-SA"/>
+        </w:rPr>
+        <w:t xml:space="preserve"> </w:t>
+      </w:r>
+      <w:r>
+        <w:rPr>
+          <w:rFonts w:ascii="Times New Roman" w:eastAsia="Times New Roman" w:hAnsi="Times New Roman" w:cs="Times New Roman"/>
+          <w:sz w:val="28"/>
+          <w:szCs w:val="28"/>
+          <w:lang w:val="en-US" w:bidi="ar-SA"/>
+        </w:rPr>
+        <w:t>competent</w:t>
       </w:r>
     </w:p>
     <w:p>
@@ -1929,6 +2344,28 @@
           <w:szCs w:val="28"/>
           <w:lang w:val="en-US" w:bidi="ar-SA"/>
         </w:rPr>
+        <w:t>d) How did Hari speak in the speech competition?</w:t>
+      </w:r>
+    </w:p>
+    <w:p>
+      <w:pPr>
+        <w:spacing w:after="0" w:line="240" w:lineRule="auto"/>
+        <w:ind w:left="288"/>
+        <w:jc w:val="both"/>
+        <w:rPr>
+          <w:rFonts w:ascii="Times New Roman" w:eastAsia="Times New Roman" w:hAnsi="Times New Roman" w:cs="Times New Roman"/>
+          <w:sz w:val="28"/>
+          <w:szCs w:val="28"/>
+          <w:lang w:val="en-US" w:bidi="ar-SA"/>
+        </w:rPr>
+      </w:pPr>
+      <w:r>
+        <w:rPr>
+          <w:rFonts w:ascii="Times New Roman" w:eastAsia="Times New Roman" w:hAnsi="Times New Roman" w:cs="Times New Roman"/>
+          <w:sz w:val="28"/>
+          <w:szCs w:val="28"/>
+          <w:lang w:val="en-US" w:bidi="ar-SA"/>
+        </w:rPr>
         <w:t xml:space="preserve">     </w:t>
       </w:r>
       <w:r>
@@ -1938,7 +2375,61 @@
           <w:szCs w:val="28"/>
           <w:lang w:val="en-US" w:bidi="ar-SA"/>
         </w:rPr>
-        <w:t>ii. Congratulation message</w:t>
+        <w:t>i. logically</w:t>
+      </w:r>
+      <w:r>
+        <w:rPr>
+          <w:rFonts w:ascii="Times New Roman" w:eastAsia="Times New Roman" w:hAnsi="Times New Roman" w:cs="Times New Roman"/>
+          <w:sz w:val="28"/>
+          <w:szCs w:val="28"/>
+          <w:lang w:val="en-US" w:bidi="ar-SA"/>
+        </w:rPr>
+        <w:tab/>
+      </w:r>
+      <w:r>
+        <w:rPr>
+          <w:rFonts w:ascii="Times New Roman" w:eastAsia="Times New Roman" w:hAnsi="Times New Roman" w:cs="Times New Roman"/>
+          <w:sz w:val="28"/>
+          <w:szCs w:val="28"/>
+          <w:lang w:val="en-US" w:bidi="ar-SA"/>
+        </w:rPr>
+        <w:t xml:space="preserve">     </w:t>
+      </w:r>
+      <w:r>
+        <w:rPr>
+          <w:rFonts w:ascii="Times New Roman" w:eastAsia="Times New Roman" w:hAnsi="Times New Roman" w:cs="Times New Roman"/>
+          <w:sz w:val="28"/>
+          <w:szCs w:val="28"/>
+          <w:lang w:val="en-US" w:bidi="ar-SA"/>
+        </w:rPr>
+        <w:t>ii. fearlessly</w:t>
+      </w:r>
+      <w:r>
+        <w:rPr>
+          <w:rFonts w:ascii="Times New Roman" w:eastAsia="Times New Roman" w:hAnsi="Times New Roman" w:cs="Times New Roman"/>
+          <w:sz w:val="28"/>
+          <w:szCs w:val="28"/>
+          <w:lang w:val="en-US" w:bidi="ar-SA"/>
+        </w:rPr>
+        <w:tab/>
+      </w:r>
+      <w:r>
+        <w:rPr>
+          <w:rFonts w:ascii="Times New Roman" w:eastAsia="Times New Roman" w:hAnsi="Times New Roman" w:cs="Times New Roman"/>
+          <w:sz w:val="28"/>
+          <w:szCs w:val="28"/>
+          <w:lang w:val="en-US" w:bidi="ar-SA"/>
+        </w:rPr>
+        <w:t xml:space="preserve">     </w:t>
+      </w:r>
+      <w:r>
+        <w:rPr>
+          <w:rFonts w:ascii="Times New Roman" w:eastAsia="Times New Roman" w:hAnsi="Times New Roman" w:cs="Times New Roman"/>
+          <w:sz w:val="28"/>
+          <w:szCs w:val="28"/>
+          <w:lang w:val="en-US" w:bidi="ar-SA"/>
+        </w:rPr>
+        <w:t>iii. confidently</w:t>
       </w:r>
     </w:p>
     <w:p>
@@ -1960,6 +2451,64 @@
           <w:szCs w:val="28"/>
           <w:lang w:val="en-US" w:bidi="ar-SA"/>
         </w:rPr>
+        <w:t>e) What made Hari win the speech contest?</w:t>
+      </w:r>
+    </w:p>
+    <w:p>
+      <w:pPr>
+        <w:spacing w:after="0" w:line="240" w:lineRule="auto"/>
+        <w:ind w:left="288"/>
+        <w:jc w:val="both"/>
+        <w:rPr>
+          <w:rFonts w:ascii="Times New Roman" w:eastAsia="Times New Roman" w:hAnsi="Times New Roman" w:cs="Times New Roman"/>
+          <w:sz w:val="28"/>
+          <w:szCs w:val="28"/>
+          <w:lang w:val="en-US" w:bidi="ar-SA"/>
+        </w:rPr>
+      </w:pPr>
+      <w:r>
+        <w:rPr>
+          <w:rFonts w:ascii="Times New Roman" w:eastAsia="Times New Roman" w:hAnsi="Times New Roman" w:cs="Times New Roman"/>
+          <w:sz w:val="28"/>
+          <w:szCs w:val="28"/>
+          <w:lang w:val="en-US" w:bidi="ar-SA"/>
+        </w:rPr>
+        <w:t xml:space="preserve">     i</w:t>
+      </w:r>
+      <w:r>
+        <w:rPr>
+          <w:rFonts w:ascii="Times New Roman" w:eastAsia="Times New Roman" w:hAnsi="Times New Roman" w:cs="Times New Roman"/>
+          <w:sz w:val="28"/>
+          <w:szCs w:val="28"/>
+          <w:lang w:val="en-US" w:bidi="ar-SA"/>
+        </w:rPr>
+        <w:t>. self-confidence</w:t>
+      </w:r>
+      <w:r>
+        <w:rPr>
+          <w:rFonts w:ascii="Times New Roman" w:eastAsia="Times New Roman" w:hAnsi="Times New Roman" w:cs="Times New Roman"/>
+          <w:sz w:val="28"/>
+          <w:szCs w:val="28"/>
+          <w:lang w:val="en-US" w:bidi="ar-SA"/>
+        </w:rPr>
+        <w:tab/>
+      </w:r>
+      <w:r>
+        <w:rPr>
+          <w:rFonts w:ascii="Times New Roman" w:eastAsia="Times New Roman" w:hAnsi="Times New Roman" w:cs="Times New Roman"/>
+          <w:sz w:val="28"/>
+          <w:szCs w:val="28"/>
+          <w:lang w:val="en-US" w:bidi="ar-SA"/>
+        </w:rPr>
+        <w:tab/>
+      </w:r>
+      <w:r>
+        <w:rPr>
+          <w:rFonts w:ascii="Times New Roman" w:eastAsia="Times New Roman" w:hAnsi="Times New Roman" w:cs="Times New Roman"/>
+          <w:sz w:val="28"/>
+          <w:szCs w:val="28"/>
+          <w:lang w:val="en-US" w:bidi="ar-SA"/>
+        </w:rPr>
         <w:t xml:space="preserve">     </w:t>
       </w:r>
       <w:r>
@@ -1969,17 +2518,268 @@
           <w:szCs w:val="28"/>
           <w:lang w:val="en-US" w:bidi="ar-SA"/>
         </w:rPr>
-        <w:t>iii. speech competition</w:t>
-      </w:r>
-      <w:r>
-        <w:rPr>
-          <w:rFonts w:ascii="Times New Roman" w:eastAsia="Times New Roman" w:hAnsi="Times New Roman" w:cs="Times New Roman"/>
+        <w:t>ii. fearless spirit</w:t>
+      </w:r>
+    </w:p>
+    <w:p>
+      <w:pPr>
+        <w:spacing w:after="0" w:line="240" w:lineRule="auto"/>
+        <w:ind w:left="288"/>
+        <w:jc w:val="both"/>
+        <w:rPr>
+          <w:rFonts w:ascii="Times New Roman" w:eastAsia="Times New Roman" w:hAnsi="Times New Roman" w:cs="Times New Roman"/>
+          <w:sz w:val="28"/>
+          <w:szCs w:val="28"/>
+          <w:lang w:val="en-US" w:bidi="ar-SA"/>
+        </w:rPr>
+      </w:pPr>
+      <w:r>
+        <w:rPr>
+          <w:rFonts w:ascii="Times New Roman" w:eastAsia="Times New Roman" w:hAnsi="Times New Roman" w:cs="Times New Roman"/>
+          <w:sz w:val="28"/>
+          <w:szCs w:val="28"/>
+          <w:lang w:val="en-US" w:bidi="ar-SA"/>
+        </w:rPr>
+        <w:t xml:space="preserve">     </w:t>
+      </w:r>
+      <w:r>
+        <w:rPr>
+          <w:rFonts w:ascii="Times New Roman" w:eastAsia="Times New Roman" w:hAnsi="Times New Roman" w:cs="Times New Roman"/>
+          <w:sz w:val="28"/>
+          <w:szCs w:val="28"/>
+          <w:lang w:val="en-US" w:bidi="ar-SA"/>
+        </w:rPr>
+        <w:t>iii. both (i) and (ii)</w:t>
+      </w:r>
+    </w:p>
+    <w:p>
+      <w:pPr>
+        <w:spacing w:after="0" w:line="240" w:lineRule="auto"/>
+        <w:jc w:val="both"/>
+        <w:rPr>
+          <w:rFonts w:ascii="Times New Roman" w:eastAsia="Times New Roman" w:hAnsi="Times New Roman" w:cs="Times New Roman"/>
+          <w:b/>
+          <w:sz w:val="28"/>
+          <w:szCs w:val="28"/>
+          <w:lang w:val="en-US" w:bidi="ar-SA"/>
+        </w:rPr>
+      </w:pPr>
+    </w:p>
+    <w:p>
+      <w:pPr>
+        <w:spacing w:after="0" w:line="240" w:lineRule="auto"/>
+        <w:jc w:val="both"/>
+        <w:rPr>
+          <w:rFonts w:ascii="Times New Roman" w:eastAsia="Times New Roman" w:hAnsi="Times New Roman" w:cs="Times New Roman"/>
+          <w:b/>
+          <w:sz w:val="28"/>
+          <w:szCs w:val="28"/>
+          <w:lang w:val="en-US" w:bidi="ar-SA"/>
+        </w:rPr>
+      </w:pPr>
+    </w:p>
+    <w:p>
+      <w:pPr>
+        <w:spacing w:after="0" w:line="240" w:lineRule="auto"/>
+        <w:jc w:val="both"/>
+        <w:rPr>
+          <w:rFonts w:ascii="Times New Roman" w:eastAsia="Times New Roman" w:hAnsi="Times New Roman" w:cs="Times New Roman"/>
+          <w:b/>
+          <w:sz w:val="28"/>
+          <w:szCs w:val="28"/>
+          <w:lang w:val="en-US" w:bidi="ar-SA"/>
+        </w:rPr>
+      </w:pPr>
+    </w:p>
+    <w:p>
+      <w:pPr>
+        <w:spacing w:after="0" w:line="240" w:lineRule="auto"/>
+        <w:jc w:val="both"/>
+        <w:rPr>
+          <w:rFonts w:ascii="Times New Roman" w:eastAsia="Times New Roman" w:hAnsi="Times New Roman" w:cs="Times New Roman"/>
+          <w:b/>
+          <w:sz w:val="28"/>
+          <w:szCs w:val="28"/>
+          <w:lang w:val="en-US" w:bidi="ar-SA"/>
+        </w:rPr>
+      </w:pPr>
+      <w:r>
+        <w:rPr>
+          <w:rFonts w:ascii="Times New Roman" w:eastAsia="Times New Roman" w:hAnsi="Times New Roman" w:cs="Times New Roman"/>
+          <w:b/>
+          <w:sz w:val="28"/>
+          <w:szCs w:val="28"/>
+          <w:lang w:val="en-US" w:bidi="ar-SA"/>
+        </w:rPr>
+        <w:t>5</w:t>
+      </w:r>
+      <w:r>
+        <w:rPr>
+          <w:rFonts w:ascii="Times New Roman" w:eastAsia="Times New Roman" w:hAnsi="Times New Roman" w:cs="Times New Roman"/>
+          <w:b/>
+          <w:sz w:val="28"/>
+          <w:szCs w:val="28"/>
+          <w:lang w:val="en-US" w:bidi="ar-SA"/>
+        </w:rPr>
+        <w:t>)</w:t>
+      </w:r>
+      <w:r>
+        <w:rPr>
+          <w:rFonts w:ascii="Times New Roman" w:eastAsia="Times New Roman" w:hAnsi="Times New Roman" w:cs="Times New Roman"/>
+          <w:b/>
+          <w:sz w:val="28"/>
+          <w:szCs w:val="28"/>
+          <w:lang w:val="en-US" w:bidi="ar-SA"/>
+        </w:rPr>
+        <w:t xml:space="preserve"> Punctuate the following passage.</w:t>
+      </w:r>
+      <w:r>
+        <w:rPr>
+          <w:rFonts w:ascii="Times New Roman" w:eastAsia="Times New Roman" w:hAnsi="Times New Roman" w:cs="Times New Roman"/>
+          <w:b/>
+          <w:sz w:val="28"/>
+          <w:szCs w:val="28"/>
+          <w:lang w:val="en-US" w:bidi="ar-SA"/>
+        </w:rPr>
+        <w:t xml:space="preserve">      </w:t>
+      </w:r>
+      <w:r>
+        <w:rPr>
+          <w:rFonts w:ascii="Times New Roman" w:eastAsia="Times New Roman" w:hAnsi="Times New Roman" w:cs="Times New Roman"/>
+          <w:b/>
+          <w:sz w:val="28"/>
+          <w:szCs w:val="28"/>
+          <w:lang w:val="en-US" w:bidi="ar-SA"/>
+        </w:rPr>
+        <w:t xml:space="preserve">                       (10×0.5=5)</w:t>
+      </w:r>
+    </w:p>
+    <w:p>
+      <w:pPr>
+        <w:spacing w:after="0" w:line="240" w:lineRule="auto"/>
+        <w:ind w:left="288"/>
+        <w:jc w:val="both"/>
+        <w:rPr>
+          <w:rFonts w:ascii="Times New Roman" w:eastAsia="Times New Roman" w:hAnsi="Times New Roman" w:cs="Times New Roman"/>
+          <w:sz w:val="28"/>
+          <w:szCs w:val="28"/>
+          <w:lang w:val="en-US" w:bidi="ar-SA"/>
+        </w:rPr>
+      </w:pPr>
+      <w:r>
+        <w:rPr>
+          <w:rFonts w:ascii="Times New Roman" w:eastAsia="Times New Roman" w:hAnsi="Times New Roman" w:cs="Times New Roman"/>
+          <w:sz w:val="28"/>
+          <w:szCs w:val="28"/>
+          <w:lang w:val="en-US" w:bidi="ar-SA"/>
+        </w:rPr>
+        <w:t>my name is lalit saud . i am from achham. it lies in far west province </w:t>
+      </w:r>
+    </w:p>
+    <w:p>
+      <w:pPr>
+        <w:spacing w:after="0" w:line="240" w:lineRule="auto"/>
+        <w:jc w:val="both"/>
+        <w:rPr>
+          <w:rFonts w:ascii="Times New Roman" w:eastAsia="Times New Roman" w:hAnsi="Times New Roman" w:cs="Times New Roman"/>
+          <w:sz w:val="28"/>
+          <w:szCs w:val="28"/>
+          <w:lang w:val="en-US" w:bidi="ar-SA"/>
+        </w:rPr>
+      </w:pPr>
+    </w:p>
+    <w:p>
+      <w:pPr>
+        <w:spacing w:after="0" w:line="240" w:lineRule="auto"/>
+        <w:jc w:val="both"/>
+        <w:rPr>
+          <w:rFonts w:ascii="Times New Roman" w:eastAsia="Times New Roman" w:hAnsi="Times New Roman" w:cs="Times New Roman"/>
+          <w:b/>
+          <w:sz w:val="28"/>
+          <w:szCs w:val="28"/>
+          <w:lang w:val="en-US" w:bidi="ar-SA"/>
+        </w:rPr>
+      </w:pPr>
+      <w:r>
+        <w:rPr>
+          <w:rFonts w:ascii="Times New Roman" w:eastAsia="Times New Roman" w:hAnsi="Times New Roman" w:cs="Times New Roman"/>
+          <w:b/>
+          <w:sz w:val="28"/>
+          <w:szCs w:val="28"/>
+          <w:lang w:val="en-US" w:bidi="ar-SA"/>
+        </w:rPr>
+        <w:t>6</w:t>
+      </w:r>
+      <w:r>
+        <w:rPr>
+          <w:rFonts w:ascii="Times New Roman" w:eastAsia="Times New Roman" w:hAnsi="Times New Roman" w:cs="Times New Roman"/>
+          <w:b/>
+          <w:sz w:val="28"/>
+          <w:szCs w:val="28"/>
+          <w:lang w:val="en-US" w:bidi="ar-SA"/>
+        </w:rPr>
+        <w:t>)</w:t>
+      </w:r>
+      <w:r>
+        <w:rPr>
+          <w:rFonts w:ascii="Times New Roman" w:eastAsia="Times New Roman" w:hAnsi="Times New Roman" w:cs="Times New Roman"/>
+          <w:b/>
+          <w:sz w:val="28"/>
+          <w:szCs w:val="28"/>
+          <w:lang w:val="en-US" w:bidi="ar-SA"/>
+        </w:rPr>
+        <w:t xml:space="preserve"> Make</w:t>
+      </w:r>
+      <w:r>
+        <w:rPr>
+          <w:rFonts w:ascii="Times New Roman" w:eastAsia="Times New Roman" w:hAnsi="Times New Roman" w:cs="Times New Roman"/>
+          <w:b/>
           <w:sz w:val="28"/>
           <w:szCs w:val="28"/>
           <w:lang w:val="en-US" w:bidi="ar-SA"/>
         </w:rPr>
         <w:t xml:space="preserve"> </w:t>
       </w:r>
+      <w:r>
+        <w:rPr>
+          <w:rFonts w:ascii="Times New Roman" w:eastAsia="Times New Roman" w:hAnsi="Times New Roman" w:cs="Times New Roman"/>
+          <w:b/>
+          <w:sz w:val="28"/>
+          <w:szCs w:val="28"/>
+          <w:lang w:val="en-US" w:bidi="ar-SA"/>
+        </w:rPr>
+        <w:t>sentence</w:t>
+      </w:r>
+      <w:r>
+        <w:rPr>
+          <w:rFonts w:ascii="Times New Roman" w:eastAsia="Times New Roman" w:hAnsi="Times New Roman" w:cs="Times New Roman"/>
+          <w:b/>
+          <w:sz w:val="28"/>
+          <w:szCs w:val="28"/>
+          <w:lang w:val="en-US" w:bidi="ar-SA"/>
+        </w:rPr>
+        <w:t>s</w:t>
+      </w:r>
+      <w:r>
+        <w:rPr>
+          <w:rFonts w:ascii="Times New Roman" w:eastAsia="Times New Roman" w:hAnsi="Times New Roman" w:cs="Times New Roman"/>
+          <w:b/>
+          <w:sz w:val="28"/>
+          <w:szCs w:val="28"/>
+          <w:lang w:val="en-US" w:bidi="ar-SA"/>
+        </w:rPr>
+        <w:t xml:space="preserve"> by using the following words.</w:t>
+      </w:r>
+      <w:r>
+        <w:rPr>
+          <w:rFonts w:ascii="Times New Roman" w:eastAsia="Times New Roman" w:hAnsi="Times New Roman" w:cs="Times New Roman"/>
+          <w:b/>
+          <w:sz w:val="28"/>
+          <w:szCs w:val="28"/>
+          <w:lang w:val="en-US" w:bidi="ar-SA"/>
+        </w:rPr>
+        <w:t xml:space="preserve">      (5×1=5)</w:t>
+      </w:r>
     </w:p>
     <w:p>
       <w:pPr>
@@ -2000,7 +2800,25 @@
           <w:szCs w:val="28"/>
           <w:lang w:val="en-US" w:bidi="ar-SA"/>
         </w:rPr>
-        <w:t>c) How were the other participants?</w:t>
+        <w:t xml:space="preserve">a. </w:t>
+      </w:r>
+      <w:r>
+        <w:rPr>
+          <w:rFonts w:ascii="Times New Roman" w:eastAsia="Times New Roman" w:hAnsi="Times New Roman" w:cs="Times New Roman"/>
+          <w:sz w:val="28"/>
+          <w:szCs w:val="28"/>
+          <w:lang w:val="en-US" w:bidi="ar-SA"/>
+        </w:rPr>
+        <w:t>f</w:t>
+      </w:r>
+      <w:r>
+        <w:rPr>
+          <w:rFonts w:ascii="Times New Roman" w:eastAsia="Times New Roman" w:hAnsi="Times New Roman" w:cs="Times New Roman"/>
+          <w:sz w:val="28"/>
+          <w:szCs w:val="28"/>
+          <w:lang w:val="en-US" w:bidi="ar-SA"/>
+        </w:rPr>
+        <w:t>amous </w:t>
       </w:r>
     </w:p>
     <w:p>
@@ -2022,16 +2840,25 @@
           <w:szCs w:val="28"/>
           <w:lang w:val="en-US" w:bidi="ar-SA"/>
         </w:rPr>
-        <w:t xml:space="preserve">     </w:t>
-      </w:r>
-      <w:r>
-        <w:rPr>
-          <w:rFonts w:ascii="Times New Roman" w:eastAsia="Times New Roman" w:hAnsi="Times New Roman" w:cs="Times New Roman"/>
-          <w:sz w:val="28"/>
-          <w:szCs w:val="28"/>
-          <w:lang w:val="en-US" w:bidi="ar-SA"/>
-        </w:rPr>
-        <w:t>i. fearless</w:t>
+        <w:t xml:space="preserve">b. </w:t>
+      </w:r>
+      <w:r>
+        <w:rPr>
+          <w:rFonts w:ascii="Times New Roman" w:eastAsia="Times New Roman" w:hAnsi="Times New Roman" w:cs="Times New Roman"/>
+          <w:sz w:val="28"/>
+          <w:szCs w:val="28"/>
+          <w:lang w:val="en-US" w:bidi="ar-SA"/>
+        </w:rPr>
+        <w:t>a</w:t>
+      </w:r>
+      <w:r>
+        <w:rPr>
+          <w:rFonts w:ascii="Times New Roman" w:eastAsia="Times New Roman" w:hAnsi="Times New Roman" w:cs="Times New Roman"/>
+          <w:sz w:val="28"/>
+          <w:szCs w:val="28"/>
+          <w:lang w:val="en-US" w:bidi="ar-SA"/>
+        </w:rPr>
+        <w:t>ttractions </w:t>
       </w:r>
     </w:p>
     <w:p>
@@ -2053,16 +2880,25 @@
           <w:szCs w:val="28"/>
           <w:lang w:val="en-US" w:bidi="ar-SA"/>
         </w:rPr>
-        <w:t xml:space="preserve">     </w:t>
-      </w:r>
-      <w:r>
-        <w:rPr>
-          <w:rFonts w:ascii="Times New Roman" w:eastAsia="Times New Roman" w:hAnsi="Times New Roman" w:cs="Times New Roman"/>
-          <w:sz w:val="28"/>
-          <w:szCs w:val="28"/>
-          <w:lang w:val="en-US" w:bidi="ar-SA"/>
-        </w:rPr>
-        <w:t>ii. dull</w:t>
+        <w:t xml:space="preserve">c. </w:t>
+      </w:r>
+      <w:r>
+        <w:rPr>
+          <w:rFonts w:ascii="Times New Roman" w:eastAsia="Times New Roman" w:hAnsi="Times New Roman" w:cs="Times New Roman"/>
+          <w:sz w:val="28"/>
+          <w:szCs w:val="28"/>
+          <w:lang w:val="en-US" w:bidi="ar-SA"/>
+        </w:rPr>
+        <w:t>b</w:t>
+      </w:r>
+      <w:r>
+        <w:rPr>
+          <w:rFonts w:ascii="Times New Roman" w:eastAsia="Times New Roman" w:hAnsi="Times New Roman" w:cs="Times New Roman"/>
+          <w:sz w:val="28"/>
+          <w:szCs w:val="28"/>
+          <w:lang w:val="en-US" w:bidi="ar-SA"/>
+        </w:rPr>
+        <w:t>iggest </w:t>
       </w:r>
     </w:p>
     <w:p>
@@ -2084,20 +2920,116 @@
           <w:szCs w:val="28"/>
           <w:lang w:val="en-US" w:bidi="ar-SA"/>
         </w:rPr>
-        <w:t xml:space="preserve">     </w:t>
-      </w:r>
-      <w:r>
-        <w:rPr>
-          <w:rFonts w:ascii="Times New Roman" w:eastAsia="Times New Roman" w:hAnsi="Times New Roman" w:cs="Times New Roman"/>
-          <w:sz w:val="28"/>
-          <w:szCs w:val="28"/>
-          <w:lang w:val="en-US" w:bidi="ar-SA"/>
-        </w:rPr>
-        <w:t>iii.</w:t>
-      </w:r>
-      <w:r>
-        <w:rPr>
-          <w:rFonts w:ascii="Times New Roman" w:eastAsia="Times New Roman" w:hAnsi="Times New Roman" w:cs="Times New Roman"/>
+        <w:t xml:space="preserve">d. </w:t>
+      </w:r>
+      <w:r>
+        <w:rPr>
+          <w:rFonts w:ascii="Times New Roman" w:eastAsia="Times New Roman" w:hAnsi="Times New Roman" w:cs="Times New Roman"/>
+          <w:sz w:val="28"/>
+          <w:szCs w:val="28"/>
+          <w:lang w:val="en-US" w:bidi="ar-SA"/>
+        </w:rPr>
+        <w:t>m</w:t>
+      </w:r>
+      <w:r>
+        <w:rPr>
+          <w:rFonts w:ascii="Times New Roman" w:eastAsia="Times New Roman" w:hAnsi="Times New Roman" w:cs="Times New Roman"/>
+          <w:sz w:val="28"/>
+          <w:szCs w:val="28"/>
+          <w:lang w:val="en-US" w:bidi="ar-SA"/>
+        </w:rPr>
+        <w:t>ountain </w:t>
+      </w:r>
+    </w:p>
+    <w:p>
+      <w:pPr>
+        <w:spacing w:after="0" w:line="240" w:lineRule="auto"/>
+        <w:ind w:left="288"/>
+        <w:jc w:val="both"/>
+        <w:rPr>
+          <w:rFonts w:ascii="Times New Roman" w:eastAsia="Times New Roman" w:hAnsi="Times New Roman" w:cs="Times New Roman"/>
+          <w:sz w:val="28"/>
+          <w:szCs w:val="28"/>
+          <w:lang w:val="en-US" w:bidi="ar-SA"/>
+        </w:rPr>
+      </w:pPr>
+      <w:r>
+        <w:rPr>
+          <w:rFonts w:ascii="Times New Roman" w:eastAsia="Times New Roman" w:hAnsi="Times New Roman" w:cs="Times New Roman"/>
+          <w:sz w:val="28"/>
+          <w:szCs w:val="28"/>
+          <w:lang w:val="en-US" w:bidi="ar-SA"/>
+        </w:rPr>
+        <w:t xml:space="preserve">e. </w:t>
+      </w:r>
+      <w:r>
+        <w:rPr>
+          <w:rFonts w:ascii="Times New Roman" w:eastAsia="Times New Roman" w:hAnsi="Times New Roman" w:cs="Times New Roman"/>
+          <w:sz w:val="28"/>
+          <w:szCs w:val="28"/>
+          <w:lang w:val="en-US" w:bidi="ar-SA"/>
+        </w:rPr>
+        <w:t>b</w:t>
+      </w:r>
+      <w:r>
+        <w:rPr>
+          <w:rFonts w:ascii="Times New Roman" w:eastAsia="Times New Roman" w:hAnsi="Times New Roman" w:cs="Times New Roman"/>
+          <w:sz w:val="28"/>
+          <w:szCs w:val="28"/>
+          <w:lang w:val="en-US" w:bidi="ar-SA"/>
+        </w:rPr>
+        <w:t>etween </w:t>
+      </w:r>
+    </w:p>
+    <w:p>
+      <w:pPr>
+        <w:spacing w:after="0" w:line="240" w:lineRule="auto"/>
+        <w:jc w:val="both"/>
+        <w:rPr>
+          <w:rFonts w:ascii="Times New Roman" w:eastAsia="Times New Roman" w:hAnsi="Times New Roman" w:cs="Times New Roman"/>
+          <w:sz w:val="28"/>
+          <w:szCs w:val="28"/>
+          <w:lang w:val="en-US" w:bidi="ar-SA"/>
+        </w:rPr>
+      </w:pPr>
+    </w:p>
+    <w:p>
+      <w:pPr>
+        <w:spacing w:after="0" w:line="240" w:lineRule="auto"/>
+        <w:ind w:left="270" w:hanging="270"/>
+        <w:jc w:val="both"/>
+        <w:rPr>
+          <w:rFonts w:ascii="Times New Roman" w:eastAsia="Times New Roman" w:hAnsi="Times New Roman" w:cs="Times New Roman"/>
+          <w:b/>
+          <w:sz w:val="28"/>
+          <w:szCs w:val="28"/>
+          <w:lang w:val="en-US" w:bidi="ar-SA"/>
+        </w:rPr>
+      </w:pPr>
+      <w:r>
+        <w:rPr>
+          <w:rFonts w:ascii="Times New Roman" w:eastAsia="Times New Roman" w:hAnsi="Times New Roman" w:cs="Times New Roman"/>
+          <w:b/>
+          <w:sz w:val="28"/>
+          <w:szCs w:val="28"/>
+          <w:lang w:val="en-US" w:bidi="ar-SA"/>
+        </w:rPr>
+        <w:t>7</w:t>
+      </w:r>
+      <w:r>
+        <w:rPr>
+          <w:rFonts w:ascii="Times New Roman" w:eastAsia="Times New Roman" w:hAnsi="Times New Roman" w:cs="Times New Roman"/>
+          <w:b/>
+          <w:sz w:val="28"/>
+          <w:szCs w:val="28"/>
+          <w:lang w:val="en-US" w:bidi="ar-SA"/>
+        </w:rPr>
+        <w:t>)</w:t>
+      </w:r>
+      <w:r>
+        <w:rPr>
+          <w:rFonts w:ascii="Times New Roman" w:eastAsia="Times New Roman" w:hAnsi="Times New Roman" w:cs="Times New Roman"/>
+          <w:b/>
           <w:sz w:val="28"/>
           <w:szCs w:val="28"/>
           <w:lang w:val="en-US" w:bidi="ar-SA"/>
@@ -2107,11 +3039,32 @@
       <w:r>
         <w:rPr>
           <w:rFonts w:ascii="Times New Roman" w:eastAsia="Times New Roman" w:hAnsi="Times New Roman" w:cs="Times New Roman"/>
-          <w:sz w:val="28"/>
-          <w:szCs w:val="28"/>
-          <w:lang w:val="en-US" w:bidi="ar-SA"/>
-        </w:rPr>
-        <w:t>competent</w:t>
+          <w:b/>
+          <w:sz w:val="28"/>
+          <w:szCs w:val="28"/>
+          <w:lang w:val="en-US" w:bidi="ar-SA"/>
+        </w:rPr>
+        <w:t>Develop the following outlines into a story. Al</w:t>
+      </w:r>
+      <w:r>
+        <w:rPr>
+          <w:rFonts w:ascii="Times New Roman" w:eastAsia="Times New Roman" w:hAnsi="Times New Roman" w:cs="Times New Roman"/>
+          <w:b/>
+          <w:sz w:val="28"/>
+          <w:szCs w:val="28"/>
+          <w:lang w:val="en-US" w:bidi="ar-SA"/>
+        </w:rPr>
+        <w:t>so give a suitable title of the story. </w:t>
+      </w:r>
+      <w:r>
+        <w:rPr>
+          <w:rFonts w:ascii="Times New Roman" w:eastAsia="Times New Roman" w:hAnsi="Times New Roman" w:cs="Times New Roman"/>
+          <w:b/>
+          <w:sz w:val="28"/>
+          <w:szCs w:val="28"/>
+          <w:lang w:val="en-US" w:bidi="ar-SA"/>
+        </w:rPr>
+        <w:t xml:space="preserve">                                                       5</w:t>
       </w:r>
     </w:p>
     <w:p>
@@ -2133,264 +3086,96 @@
           <w:szCs w:val="28"/>
           <w:lang w:val="en-US" w:bidi="ar-SA"/>
         </w:rPr>
-        <w:t>d) How did Hari speak in the speech competition?</w:t>
-      </w:r>
-    </w:p>
-    <w:p>
-      <w:pPr>
-        <w:spacing w:after="0" w:line="240" w:lineRule="auto"/>
-        <w:ind w:left="288"/>
-        <w:jc w:val="both"/>
-        <w:rPr>
-          <w:rFonts w:ascii="Times New Roman" w:eastAsia="Times New Roman" w:hAnsi="Times New Roman" w:cs="Times New Roman"/>
-          <w:sz w:val="28"/>
-          <w:szCs w:val="28"/>
-          <w:lang w:val="en-US" w:bidi="ar-SA"/>
-        </w:rPr>
-      </w:pPr>
-      <w:r>
-        <w:rPr>
-          <w:rFonts w:ascii="Times New Roman" w:eastAsia="Times New Roman" w:hAnsi="Times New Roman" w:cs="Times New Roman"/>
-          <w:sz w:val="28"/>
-          <w:szCs w:val="28"/>
-          <w:lang w:val="en-US" w:bidi="ar-SA"/>
-        </w:rPr>
-        <w:t xml:space="preserve">     </w:t>
-      </w:r>
-      <w:r>
-        <w:rPr>
-          <w:rFonts w:ascii="Times New Roman" w:eastAsia="Times New Roman" w:hAnsi="Times New Roman" w:cs="Times New Roman"/>
-          <w:sz w:val="28"/>
-          <w:szCs w:val="28"/>
-          <w:lang w:val="en-US" w:bidi="ar-SA"/>
-        </w:rPr>
-        <w:t>i. logically</w:t>
-      </w:r>
-    </w:p>
-    <w:p>
-      <w:pPr>
-        <w:spacing w:after="0" w:line="240" w:lineRule="auto"/>
-        <w:ind w:left="288"/>
-        <w:jc w:val="both"/>
-        <w:rPr>
-          <w:rFonts w:ascii="Times New Roman" w:eastAsia="Times New Roman" w:hAnsi="Times New Roman" w:cs="Times New Roman"/>
-          <w:sz w:val="28"/>
-          <w:szCs w:val="28"/>
-          <w:lang w:val="en-US" w:bidi="ar-SA"/>
-        </w:rPr>
-      </w:pPr>
-      <w:r>
-        <w:rPr>
-          <w:rFonts w:ascii="Times New Roman" w:eastAsia="Times New Roman" w:hAnsi="Times New Roman" w:cs="Times New Roman"/>
-          <w:sz w:val="28"/>
-          <w:szCs w:val="28"/>
-          <w:lang w:val="en-US" w:bidi="ar-SA"/>
-        </w:rPr>
-        <w:t xml:space="preserve">     </w:t>
-      </w:r>
-      <w:r>
-        <w:rPr>
-          <w:rFonts w:ascii="Times New Roman" w:eastAsia="Times New Roman" w:hAnsi="Times New Roman" w:cs="Times New Roman"/>
-          <w:sz w:val="28"/>
-          <w:szCs w:val="28"/>
-          <w:lang w:val="en-US" w:bidi="ar-SA"/>
-        </w:rPr>
-        <w:t>ii. fearlessly</w:t>
-      </w:r>
-    </w:p>
-    <w:p>
-      <w:pPr>
-        <w:spacing w:after="0" w:line="240" w:lineRule="auto"/>
-        <w:ind w:left="288"/>
-        <w:jc w:val="both"/>
-        <w:rPr>
-          <w:rFonts w:ascii="Times New Roman" w:eastAsia="Times New Roman" w:hAnsi="Times New Roman" w:cs="Times New Roman"/>
-          <w:sz w:val="28"/>
-          <w:szCs w:val="28"/>
-          <w:lang w:val="en-US" w:bidi="ar-SA"/>
-        </w:rPr>
-      </w:pPr>
-      <w:r>
-        <w:rPr>
-          <w:rFonts w:ascii="Times New Roman" w:eastAsia="Times New Roman" w:hAnsi="Times New Roman" w:cs="Times New Roman"/>
-          <w:sz w:val="28"/>
-          <w:szCs w:val="28"/>
-          <w:lang w:val="en-US" w:bidi="ar-SA"/>
-        </w:rPr>
-        <w:t xml:space="preserve">     </w:t>
-      </w:r>
-      <w:r>
-        <w:rPr>
-          <w:rFonts w:ascii="Times New Roman" w:eastAsia="Times New Roman" w:hAnsi="Times New Roman" w:cs="Times New Roman"/>
-          <w:sz w:val="28"/>
-          <w:szCs w:val="28"/>
-          <w:lang w:val="en-US" w:bidi="ar-SA"/>
-        </w:rPr>
-        <w:t>iii. confidently</w:t>
-      </w:r>
-    </w:p>
-    <w:p>
-      <w:pPr>
-        <w:spacing w:after="0" w:line="240" w:lineRule="auto"/>
-        <w:ind w:left="288"/>
-        <w:jc w:val="both"/>
-        <w:rPr>
-          <w:rFonts w:ascii="Times New Roman" w:eastAsia="Times New Roman" w:hAnsi="Times New Roman" w:cs="Times New Roman"/>
-          <w:sz w:val="28"/>
-          <w:szCs w:val="28"/>
-          <w:lang w:val="en-US" w:bidi="ar-SA"/>
-        </w:rPr>
-      </w:pPr>
-      <w:r>
-        <w:rPr>
-          <w:rFonts w:ascii="Times New Roman" w:eastAsia="Times New Roman" w:hAnsi="Times New Roman" w:cs="Times New Roman"/>
-          <w:sz w:val="28"/>
-          <w:szCs w:val="28"/>
-          <w:lang w:val="en-US" w:bidi="ar-SA"/>
-        </w:rPr>
-        <w:t>e) What made Hari win the speech contest?</w:t>
-      </w:r>
-    </w:p>
-    <w:p>
-      <w:pPr>
-        <w:spacing w:after="0" w:line="240" w:lineRule="auto"/>
-        <w:ind w:left="288"/>
-        <w:jc w:val="both"/>
-        <w:rPr>
-          <w:rFonts w:ascii="Times New Roman" w:eastAsia="Times New Roman" w:hAnsi="Times New Roman" w:cs="Times New Roman"/>
-          <w:sz w:val="28"/>
-          <w:szCs w:val="28"/>
-          <w:lang w:val="en-US" w:bidi="ar-SA"/>
-        </w:rPr>
-      </w:pPr>
-      <w:r>
-        <w:rPr>
-          <w:rFonts w:ascii="Times New Roman" w:eastAsia="Times New Roman" w:hAnsi="Times New Roman" w:cs="Times New Roman"/>
-          <w:sz w:val="28"/>
-          <w:szCs w:val="28"/>
-          <w:lang w:val="en-US" w:bidi="ar-SA"/>
-        </w:rPr>
-        <w:t xml:space="preserve">     i</w:t>
-      </w:r>
-      <w:r>
-        <w:rPr>
-          <w:rFonts w:ascii="Times New Roman" w:eastAsia="Times New Roman" w:hAnsi="Times New Roman" w:cs="Times New Roman"/>
-          <w:sz w:val="28"/>
-          <w:szCs w:val="28"/>
-          <w:lang w:val="en-US" w:bidi="ar-SA"/>
-        </w:rPr>
-        <w:t>. self-confidence</w:t>
-      </w:r>
-    </w:p>
-    <w:p>
-      <w:pPr>
-        <w:spacing w:after="0" w:line="240" w:lineRule="auto"/>
-        <w:ind w:left="288"/>
-        <w:jc w:val="both"/>
-        <w:rPr>
-          <w:rFonts w:ascii="Times New Roman" w:eastAsia="Times New Roman" w:hAnsi="Times New Roman" w:cs="Times New Roman"/>
-          <w:sz w:val="28"/>
-          <w:szCs w:val="28"/>
-          <w:lang w:val="en-US" w:bidi="ar-SA"/>
-        </w:rPr>
-      </w:pPr>
-      <w:r>
-        <w:rPr>
-          <w:rFonts w:ascii="Times New Roman" w:eastAsia="Times New Roman" w:hAnsi="Times New Roman" w:cs="Times New Roman"/>
-          <w:sz w:val="28"/>
-          <w:szCs w:val="28"/>
-          <w:lang w:val="en-US" w:bidi="ar-SA"/>
-        </w:rPr>
-        <w:t xml:space="preserve">     </w:t>
-      </w:r>
-      <w:r>
-        <w:rPr>
-          <w:rFonts w:ascii="Times New Roman" w:eastAsia="Times New Roman" w:hAnsi="Times New Roman" w:cs="Times New Roman"/>
-          <w:sz w:val="28"/>
-          <w:szCs w:val="28"/>
-          <w:lang w:val="en-US" w:bidi="ar-SA"/>
-        </w:rPr>
-        <w:t>ii. fearless spirit</w:t>
-      </w:r>
-    </w:p>
-    <w:p>
-      <w:pPr>
-        <w:spacing w:after="0" w:line="240" w:lineRule="auto"/>
-        <w:ind w:left="288"/>
-        <w:jc w:val="both"/>
-        <w:rPr>
-          <w:rFonts w:ascii="Times New Roman" w:eastAsia="Times New Roman" w:hAnsi="Times New Roman" w:cs="Times New Roman"/>
-          <w:sz w:val="28"/>
-          <w:szCs w:val="28"/>
-          <w:lang w:val="en-US" w:bidi="ar-SA"/>
-        </w:rPr>
-      </w:pPr>
-      <w:r>
-        <w:rPr>
-          <w:rFonts w:ascii="Times New Roman" w:eastAsia="Times New Roman" w:hAnsi="Times New Roman" w:cs="Times New Roman"/>
-          <w:sz w:val="28"/>
-          <w:szCs w:val="28"/>
-          <w:lang w:val="en-US" w:bidi="ar-SA"/>
-        </w:rPr>
-        <w:t xml:space="preserve">     </w:t>
-      </w:r>
-      <w:r>
-        <w:rPr>
-          <w:rFonts w:ascii="Times New Roman" w:eastAsia="Times New Roman" w:hAnsi="Times New Roman" w:cs="Times New Roman"/>
-          <w:sz w:val="28"/>
-          <w:szCs w:val="28"/>
-          <w:lang w:val="en-US" w:bidi="ar-SA"/>
-        </w:rPr>
-        <w:t>iii. both (i) and (ii)</w:t>
-      </w:r>
-    </w:p>
-    <w:p>
-      <w:pPr>
-        <w:spacing w:after="0" w:line="240" w:lineRule="auto"/>
-        <w:jc w:val="both"/>
-        <w:rPr>
-          <w:rFonts w:ascii="Times New Roman" w:eastAsia="Times New Roman" w:hAnsi="Times New Roman" w:cs="Times New Roman"/>
-          <w:b/>
-          <w:sz w:val="28"/>
-          <w:szCs w:val="28"/>
-          <w:lang w:val="en-US" w:bidi="ar-SA"/>
-        </w:rPr>
-      </w:pPr>
-    </w:p>
-    <w:p>
-      <w:pPr>
-        <w:spacing w:after="0" w:line="240" w:lineRule="auto"/>
-        <w:jc w:val="both"/>
-        <w:rPr>
-          <w:rFonts w:ascii="Times New Roman" w:eastAsia="Times New Roman" w:hAnsi="Times New Roman" w:cs="Times New Roman"/>
-          <w:b/>
-          <w:sz w:val="28"/>
-          <w:szCs w:val="28"/>
-          <w:lang w:val="en-US" w:bidi="ar-SA"/>
-        </w:rPr>
-      </w:pPr>
-    </w:p>
-    <w:p>
-      <w:pPr>
-        <w:spacing w:after="0" w:line="240" w:lineRule="auto"/>
-        <w:jc w:val="both"/>
-        <w:rPr>
-          <w:rFonts w:ascii="Times New Roman" w:eastAsia="Times New Roman" w:hAnsi="Times New Roman" w:cs="Times New Roman"/>
-          <w:b/>
-          <w:sz w:val="28"/>
-          <w:szCs w:val="28"/>
-          <w:lang w:val="en-US" w:bidi="ar-SA"/>
-        </w:rPr>
-      </w:pPr>
-      <w:r>
-        <w:rPr>
-          <w:rFonts w:ascii="Times New Roman" w:eastAsia="Times New Roman" w:hAnsi="Times New Roman" w:cs="Times New Roman"/>
-          <w:b/>
-          <w:sz w:val="28"/>
-          <w:szCs w:val="28"/>
-          <w:lang w:val="en-US" w:bidi="ar-SA"/>
-        </w:rPr>
-        <w:t>5</w:t>
+        <w:t>A farmer..........three sons........ always quarrelled.......the farmer became sick ..................,.called his sons.................</w:t>
+      </w:r>
+      <w:r>
+        <w:rPr>
+          <w:rFonts w:ascii="Times New Roman" w:eastAsia="Times New Roman" w:hAnsi="Times New Roman" w:cs="Times New Roman"/>
+          <w:sz w:val="28"/>
+          <w:szCs w:val="28"/>
+          <w:lang w:val="en-US" w:bidi="ar-SA"/>
+        </w:rPr>
+        <w:t xml:space="preserve"> </w:t>
+      </w:r>
+      <w:r>
+        <w:rPr>
+          <w:rFonts w:ascii="Times New Roman" w:eastAsia="Times New Roman" w:hAnsi="Times New Roman" w:cs="Times New Roman"/>
+          <w:sz w:val="28"/>
+          <w:szCs w:val="28"/>
+          <w:lang w:val="en-US" w:bidi="ar-SA"/>
+        </w:rPr>
+        <w:t>gave each son a piece of stick to break...</w:t>
+      </w:r>
+      <w:r>
+        <w:rPr>
+          <w:rFonts w:ascii="Times New Roman" w:eastAsia="Times New Roman" w:hAnsi="Times New Roman" w:cs="Times New Roman"/>
+          <w:sz w:val="28"/>
+          <w:szCs w:val="28"/>
+          <w:lang w:val="en-US" w:bidi="ar-SA"/>
+        </w:rPr>
+        <w:t>........</w:t>
+      </w:r>
+      <w:r>
+        <w:rPr>
+          <w:rFonts w:ascii="Times New Roman" w:eastAsia="Times New Roman" w:hAnsi="Times New Roman" w:cs="Times New Roman"/>
+          <w:sz w:val="28"/>
+          <w:szCs w:val="28"/>
+          <w:lang w:val="en-US" w:bidi="ar-SA"/>
+        </w:rPr>
+        <w:t>easily broke......... made the bundle of sticks ..........told them to break ........could not break the bundle....... old father taught them the lesson ..............told them to be united ..........didn't quarrel ............understood the power of unity ......promised their father to stay together</w:t>
+      </w:r>
+      <w:r>
+        <w:rPr>
+          <w:rFonts w:ascii="Times New Roman" w:eastAsia="Times New Roman" w:hAnsi="Times New Roman" w:cs="Times New Roman"/>
+          <w:sz w:val="28"/>
+          <w:szCs w:val="28"/>
+          <w:lang w:val="en-US" w:bidi="ar-SA"/>
+        </w:rPr>
+        <w:t xml:space="preserve"> </w:t>
+      </w:r>
+      <w:r>
+        <w:rPr>
+          <w:rFonts w:ascii="Times New Roman" w:eastAsia="Times New Roman" w:hAnsi="Times New Roman" w:cs="Times New Roman"/>
+          <w:sz w:val="28"/>
+          <w:szCs w:val="28"/>
+          <w:lang w:val="en-US" w:bidi="ar-SA"/>
+        </w:rPr>
+        <w:t>Moral: Unity is strength.</w:t>
+      </w:r>
+    </w:p>
+    <w:p>
+      <w:pPr>
+        <w:spacing w:after="0" w:line="240" w:lineRule="auto"/>
+        <w:jc w:val="both"/>
+        <w:rPr>
+          <w:rFonts w:ascii="Times New Roman" w:eastAsia="Times New Roman" w:hAnsi="Times New Roman" w:cs="Times New Roman"/>
+          <w:sz w:val="28"/>
+          <w:szCs w:val="28"/>
+          <w:lang w:val="en-US" w:bidi="ar-SA"/>
+        </w:rPr>
+      </w:pPr>
+    </w:p>
+    <w:p>
+      <w:pPr>
+        <w:spacing w:after="0" w:line="240" w:lineRule="auto"/>
+        <w:jc w:val="both"/>
+        <w:rPr>
+          <w:rFonts w:ascii="Times New Roman" w:eastAsia="Times New Roman" w:hAnsi="Times New Roman" w:cs="Times New Roman"/>
+          <w:b/>
+          <w:sz w:val="28"/>
+          <w:szCs w:val="28"/>
+          <w:lang w:val="en-US" w:bidi="ar-SA"/>
+        </w:rPr>
+      </w:pPr>
+      <w:r>
+        <w:rPr>
+          <w:rFonts w:ascii="Times New Roman" w:eastAsia="Times New Roman" w:hAnsi="Times New Roman" w:cs="Times New Roman"/>
+          <w:b/>
+          <w:sz w:val="28"/>
+          <w:szCs w:val="28"/>
+          <w:lang w:val="en-US" w:bidi="ar-SA"/>
+        </w:rPr>
+        <w:t>8</w:t>
       </w:r>
       <w:r>
         <w:rPr>
@@ -2410,84 +3195,60 @@
           <w:szCs w:val="28"/>
           <w:lang w:val="en-US" w:bidi="ar-SA"/>
         </w:rPr>
-        <w:t xml:space="preserve"> Punctuate the following passage.</w:t>
-      </w:r>
-      <w:r>
-        <w:rPr>
-          <w:rFonts w:ascii="Times New Roman" w:eastAsia="Times New Roman" w:hAnsi="Times New Roman" w:cs="Times New Roman"/>
-          <w:b/>
-          <w:sz w:val="28"/>
-          <w:szCs w:val="28"/>
-          <w:lang w:val="en-US" w:bidi="ar-SA"/>
-        </w:rPr>
-        <w:t xml:space="preserve">      </w:t>
-      </w:r>
-      <w:r>
-        <w:rPr>
-          <w:rFonts w:ascii="Times New Roman" w:eastAsia="Times New Roman" w:hAnsi="Times New Roman" w:cs="Times New Roman"/>
-          <w:b/>
-          <w:sz w:val="28"/>
-          <w:szCs w:val="28"/>
-          <w:lang w:val="en-US" w:bidi="ar-SA"/>
-        </w:rPr>
-        <w:t xml:space="preserve">                       (10×0.5=5)</w:t>
-      </w:r>
-    </w:p>
-    <w:p>
-      <w:pPr>
-        <w:spacing w:after="0" w:line="240" w:lineRule="auto"/>
-        <w:ind w:left="288"/>
-        <w:jc w:val="both"/>
-        <w:rPr>
-          <w:rFonts w:ascii="Times New Roman" w:eastAsia="Times New Roman" w:hAnsi="Times New Roman" w:cs="Times New Roman"/>
-          <w:sz w:val="28"/>
-          <w:szCs w:val="28"/>
-          <w:lang w:val="en-US" w:bidi="ar-SA"/>
-        </w:rPr>
-      </w:pPr>
-      <w:r>
-        <w:rPr>
-          <w:rFonts w:ascii="Times New Roman" w:eastAsia="Times New Roman" w:hAnsi="Times New Roman" w:cs="Times New Roman"/>
-          <w:sz w:val="28"/>
-          <w:szCs w:val="28"/>
-          <w:lang w:val="en-US" w:bidi="ar-SA"/>
-        </w:rPr>
-        <w:t>my name is lalit saud . i am from achham. it lies in far west province </w:t>
-      </w:r>
-    </w:p>
-    <w:p>
-      <w:pPr>
-        <w:spacing w:after="0" w:line="240" w:lineRule="auto"/>
-        <w:jc w:val="both"/>
-        <w:rPr>
-          <w:rFonts w:ascii="Times New Roman" w:eastAsia="Times New Roman" w:hAnsi="Times New Roman" w:cs="Times New Roman"/>
-          <w:sz w:val="28"/>
-          <w:szCs w:val="28"/>
-          <w:lang w:val="en-US" w:bidi="ar-SA"/>
-        </w:rPr>
-      </w:pPr>
-    </w:p>
-    <w:p>
-      <w:pPr>
-        <w:spacing w:after="0" w:line="240" w:lineRule="auto"/>
-        <w:jc w:val="both"/>
-        <w:rPr>
-          <w:rFonts w:ascii="Times New Roman" w:eastAsia="Times New Roman" w:hAnsi="Times New Roman" w:cs="Times New Roman"/>
-          <w:b/>
-          <w:sz w:val="28"/>
-          <w:szCs w:val="28"/>
-          <w:lang w:val="en-US" w:bidi="ar-SA"/>
-        </w:rPr>
-      </w:pPr>
-      <w:r>
-        <w:rPr>
-          <w:rFonts w:ascii="Times New Roman" w:eastAsia="Times New Roman" w:hAnsi="Times New Roman" w:cs="Times New Roman"/>
-          <w:b/>
-          <w:sz w:val="28"/>
-          <w:szCs w:val="28"/>
-          <w:lang w:val="en-US" w:bidi="ar-SA"/>
-        </w:rPr>
-        <w:t>6</w:t>
+        <w:t xml:space="preserve"> W</w:t>
+      </w:r>
+      <w:r>
+        <w:rPr>
+          <w:rFonts w:ascii="Times New Roman" w:eastAsia="Times New Roman" w:hAnsi="Times New Roman" w:cs="Times New Roman"/>
+          <w:b/>
+          <w:sz w:val="28"/>
+          <w:szCs w:val="28"/>
+          <w:lang w:val="en-US" w:bidi="ar-SA"/>
+        </w:rPr>
+        <w:t>rite a short paragraph about your school</w:t>
+      </w:r>
+      <w:r>
+        <w:rPr>
+          <w:rFonts w:ascii="Times New Roman" w:eastAsia="Times New Roman" w:hAnsi="Times New Roman" w:cs="Times New Roman"/>
+          <w:b/>
+          <w:sz w:val="28"/>
+          <w:szCs w:val="28"/>
+          <w:lang w:val="en-US" w:bidi="ar-SA"/>
+        </w:rPr>
+        <w:t>.</w:t>
+      </w:r>
+      <w:r>
+        <w:rPr>
+          <w:rFonts w:ascii="Times New Roman" w:eastAsia="Times New Roman" w:hAnsi="Times New Roman" w:cs="Times New Roman"/>
+          <w:b/>
+          <w:sz w:val="28"/>
+          <w:szCs w:val="28"/>
+          <w:lang w:val="en-US" w:bidi="ar-SA"/>
+        </w:rPr>
+        <w:t xml:space="preserve">                  5</w:t>
+      </w:r>
+    </w:p>
+    <w:p>
+      <w:pPr>
+        <w:spacing w:after="0" w:line="240" w:lineRule="auto"/>
+        <w:jc w:val="both"/>
+        <w:rPr>
+          <w:rFonts w:ascii="Times New Roman" w:eastAsia="Times New Roman" w:hAnsi="Times New Roman" w:cs="Times New Roman"/>
+          <w:b/>
+          <w:sz w:val="28"/>
+          <w:szCs w:val="28"/>
+          <w:lang w:val="en-US" w:bidi="ar-SA"/>
+        </w:rPr>
+      </w:pPr>
+      <w:r>
+        <w:rPr>
+          <w:rFonts w:ascii="Times New Roman" w:eastAsia="Times New Roman" w:hAnsi="Times New Roman" w:cs="Times New Roman"/>
+          <w:b/>
+          <w:sz w:val="28"/>
+          <w:szCs w:val="28"/>
+          <w:lang w:val="en-US" w:bidi="ar-SA"/>
+        </w:rPr>
+        <w:t>9</w:t>
       </w:r>
       <w:r>
         <w:rPr>
@@ -2507,546 +3268,6 @@
           <w:szCs w:val="28"/>
           <w:lang w:val="en-US" w:bidi="ar-SA"/>
         </w:rPr>
-        <w:t xml:space="preserve"> Make</w:t>
-      </w:r>
-      <w:r>
-        <w:rPr>
-          <w:rFonts w:ascii="Times New Roman" w:eastAsia="Times New Roman" w:hAnsi="Times New Roman" w:cs="Times New Roman"/>
-          <w:b/>
-          <w:sz w:val="28"/>
-          <w:szCs w:val="28"/>
-          <w:lang w:val="en-US" w:bidi="ar-SA"/>
-        </w:rPr>
-        <w:t xml:space="preserve"> </w:t>
-      </w:r>
-      <w:r>
-        <w:rPr>
-          <w:rFonts w:ascii="Times New Roman" w:eastAsia="Times New Roman" w:hAnsi="Times New Roman" w:cs="Times New Roman"/>
-          <w:b/>
-          <w:sz w:val="28"/>
-          <w:szCs w:val="28"/>
-          <w:lang w:val="en-US" w:bidi="ar-SA"/>
-        </w:rPr>
-        <w:t>sentence</w:t>
-      </w:r>
-      <w:r>
-        <w:rPr>
-          <w:rFonts w:ascii="Times New Roman" w:eastAsia="Times New Roman" w:hAnsi="Times New Roman" w:cs="Times New Roman"/>
-          <w:b/>
-          <w:sz w:val="28"/>
-          <w:szCs w:val="28"/>
-          <w:lang w:val="en-US" w:bidi="ar-SA"/>
-        </w:rPr>
-        <w:t>s</w:t>
-      </w:r>
-      <w:r>
-        <w:rPr>
-          <w:rFonts w:ascii="Times New Roman" w:eastAsia="Times New Roman" w:hAnsi="Times New Roman" w:cs="Times New Roman"/>
-          <w:b/>
-          <w:sz w:val="28"/>
-          <w:szCs w:val="28"/>
-          <w:lang w:val="en-US" w:bidi="ar-SA"/>
-        </w:rPr>
-        <w:t xml:space="preserve"> by using the following words.</w:t>
-      </w:r>
-      <w:r>
-        <w:rPr>
-          <w:rFonts w:ascii="Times New Roman" w:eastAsia="Times New Roman" w:hAnsi="Times New Roman" w:cs="Times New Roman"/>
-          <w:b/>
-          <w:sz w:val="28"/>
-          <w:szCs w:val="28"/>
-          <w:lang w:val="en-US" w:bidi="ar-SA"/>
-        </w:rPr>
-        <w:t xml:space="preserve">      (5×1=5)</w:t>
-      </w:r>
-    </w:p>
-    <w:p>
-      <w:pPr>
-        <w:spacing w:after="0" w:line="240" w:lineRule="auto"/>
-        <w:ind w:left="288"/>
-        <w:jc w:val="both"/>
-        <w:rPr>
-          <w:rFonts w:ascii="Times New Roman" w:eastAsia="Times New Roman" w:hAnsi="Times New Roman" w:cs="Times New Roman"/>
-          <w:sz w:val="28"/>
-          <w:szCs w:val="28"/>
-          <w:lang w:val="en-US" w:bidi="ar-SA"/>
-        </w:rPr>
-      </w:pPr>
-      <w:r>
-        <w:rPr>
-          <w:rFonts w:ascii="Times New Roman" w:eastAsia="Times New Roman" w:hAnsi="Times New Roman" w:cs="Times New Roman"/>
-          <w:sz w:val="28"/>
-          <w:szCs w:val="28"/>
-          <w:lang w:val="en-US" w:bidi="ar-SA"/>
-        </w:rPr>
-        <w:t xml:space="preserve">a. </w:t>
-      </w:r>
-      <w:r>
-        <w:rPr>
-          <w:rFonts w:ascii="Times New Roman" w:eastAsia="Times New Roman" w:hAnsi="Times New Roman" w:cs="Times New Roman"/>
-          <w:sz w:val="28"/>
-          <w:szCs w:val="28"/>
-          <w:lang w:val="en-US" w:bidi="ar-SA"/>
-        </w:rPr>
-        <w:t>f</w:t>
-      </w:r>
-      <w:r>
-        <w:rPr>
-          <w:rFonts w:ascii="Times New Roman" w:eastAsia="Times New Roman" w:hAnsi="Times New Roman" w:cs="Times New Roman"/>
-          <w:sz w:val="28"/>
-          <w:szCs w:val="28"/>
-          <w:lang w:val="en-US" w:bidi="ar-SA"/>
-        </w:rPr>
-        <w:t>amous </w:t>
-      </w:r>
-    </w:p>
-    <w:p>
-      <w:pPr>
-        <w:spacing w:after="0" w:line="240" w:lineRule="auto"/>
-        <w:ind w:left="288"/>
-        <w:jc w:val="both"/>
-        <w:rPr>
-          <w:rFonts w:ascii="Times New Roman" w:eastAsia="Times New Roman" w:hAnsi="Times New Roman" w:cs="Times New Roman"/>
-          <w:sz w:val="28"/>
-          <w:szCs w:val="28"/>
-          <w:lang w:val="en-US" w:bidi="ar-SA"/>
-        </w:rPr>
-      </w:pPr>
-      <w:r>
-        <w:rPr>
-          <w:rFonts w:ascii="Times New Roman" w:eastAsia="Times New Roman" w:hAnsi="Times New Roman" w:cs="Times New Roman"/>
-          <w:sz w:val="28"/>
-          <w:szCs w:val="28"/>
-          <w:lang w:val="en-US" w:bidi="ar-SA"/>
-        </w:rPr>
-        <w:t xml:space="preserve">b. </w:t>
-      </w:r>
-      <w:r>
-        <w:rPr>
-          <w:rFonts w:ascii="Times New Roman" w:eastAsia="Times New Roman" w:hAnsi="Times New Roman" w:cs="Times New Roman"/>
-          <w:sz w:val="28"/>
-          <w:szCs w:val="28"/>
-          <w:lang w:val="en-US" w:bidi="ar-SA"/>
-        </w:rPr>
-        <w:t>a</w:t>
-      </w:r>
-      <w:r>
-        <w:rPr>
-          <w:rFonts w:ascii="Times New Roman" w:eastAsia="Times New Roman" w:hAnsi="Times New Roman" w:cs="Times New Roman"/>
-          <w:sz w:val="28"/>
-          <w:szCs w:val="28"/>
-          <w:lang w:val="en-US" w:bidi="ar-SA"/>
-        </w:rPr>
-        <w:t>ttractions </w:t>
-      </w:r>
-    </w:p>
-    <w:p>
-      <w:pPr>
-        <w:spacing w:after="0" w:line="240" w:lineRule="auto"/>
-        <w:ind w:left="288"/>
-        <w:jc w:val="both"/>
-        <w:rPr>
-          <w:rFonts w:ascii="Times New Roman" w:eastAsia="Times New Roman" w:hAnsi="Times New Roman" w:cs="Times New Roman"/>
-          <w:sz w:val="28"/>
-          <w:szCs w:val="28"/>
-          <w:lang w:val="en-US" w:bidi="ar-SA"/>
-        </w:rPr>
-      </w:pPr>
-      <w:r>
-        <w:rPr>
-          <w:rFonts w:ascii="Times New Roman" w:eastAsia="Times New Roman" w:hAnsi="Times New Roman" w:cs="Times New Roman"/>
-          <w:sz w:val="28"/>
-          <w:szCs w:val="28"/>
-          <w:lang w:val="en-US" w:bidi="ar-SA"/>
-        </w:rPr>
-        <w:t xml:space="preserve">c. </w:t>
-      </w:r>
-      <w:r>
-        <w:rPr>
-          <w:rFonts w:ascii="Times New Roman" w:eastAsia="Times New Roman" w:hAnsi="Times New Roman" w:cs="Times New Roman"/>
-          <w:sz w:val="28"/>
-          <w:szCs w:val="28"/>
-          <w:lang w:val="en-US" w:bidi="ar-SA"/>
-        </w:rPr>
-        <w:t>b</w:t>
-      </w:r>
-      <w:r>
-        <w:rPr>
-          <w:rFonts w:ascii="Times New Roman" w:eastAsia="Times New Roman" w:hAnsi="Times New Roman" w:cs="Times New Roman"/>
-          <w:sz w:val="28"/>
-          <w:szCs w:val="28"/>
-          <w:lang w:val="en-US" w:bidi="ar-SA"/>
-        </w:rPr>
-        <w:t>iggest </w:t>
-      </w:r>
-    </w:p>
-    <w:p>
-      <w:pPr>
-        <w:spacing w:after="0" w:line="240" w:lineRule="auto"/>
-        <w:ind w:left="288"/>
-        <w:jc w:val="both"/>
-        <w:rPr>
-          <w:rFonts w:ascii="Times New Roman" w:eastAsia="Times New Roman" w:hAnsi="Times New Roman" w:cs="Times New Roman"/>
-          <w:sz w:val="28"/>
-          <w:szCs w:val="28"/>
-          <w:lang w:val="en-US" w:bidi="ar-SA"/>
-        </w:rPr>
-      </w:pPr>
-      <w:r>
-        <w:rPr>
-          <w:rFonts w:ascii="Times New Roman" w:eastAsia="Times New Roman" w:hAnsi="Times New Roman" w:cs="Times New Roman"/>
-          <w:sz w:val="28"/>
-          <w:szCs w:val="28"/>
-          <w:lang w:val="en-US" w:bidi="ar-SA"/>
-        </w:rPr>
-        <w:t xml:space="preserve">d. </w:t>
-      </w:r>
-      <w:r>
-        <w:rPr>
-          <w:rFonts w:ascii="Times New Roman" w:eastAsia="Times New Roman" w:hAnsi="Times New Roman" w:cs="Times New Roman"/>
-          <w:sz w:val="28"/>
-          <w:szCs w:val="28"/>
-          <w:lang w:val="en-US" w:bidi="ar-SA"/>
-        </w:rPr>
-        <w:t>m</w:t>
-      </w:r>
-      <w:r>
-        <w:rPr>
-          <w:rFonts w:ascii="Times New Roman" w:eastAsia="Times New Roman" w:hAnsi="Times New Roman" w:cs="Times New Roman"/>
-          <w:sz w:val="28"/>
-          <w:szCs w:val="28"/>
-          <w:lang w:val="en-US" w:bidi="ar-SA"/>
-        </w:rPr>
-        <w:t>ountain </w:t>
-      </w:r>
-    </w:p>
-    <w:p>
-      <w:pPr>
-        <w:spacing w:after="0" w:line="240" w:lineRule="auto"/>
-        <w:ind w:left="288"/>
-        <w:jc w:val="both"/>
-        <w:rPr>
-          <w:rFonts w:ascii="Times New Roman" w:eastAsia="Times New Roman" w:hAnsi="Times New Roman" w:cs="Times New Roman"/>
-          <w:sz w:val="28"/>
-          <w:szCs w:val="28"/>
-          <w:lang w:val="en-US" w:bidi="ar-SA"/>
-        </w:rPr>
-      </w:pPr>
-      <w:r>
-        <w:rPr>
-          <w:rFonts w:ascii="Times New Roman" w:eastAsia="Times New Roman" w:hAnsi="Times New Roman" w:cs="Times New Roman"/>
-          <w:sz w:val="28"/>
-          <w:szCs w:val="28"/>
-          <w:lang w:val="en-US" w:bidi="ar-SA"/>
-        </w:rPr>
-        <w:t xml:space="preserve">e. </w:t>
-      </w:r>
-      <w:r>
-        <w:rPr>
-          <w:rFonts w:ascii="Times New Roman" w:eastAsia="Times New Roman" w:hAnsi="Times New Roman" w:cs="Times New Roman"/>
-          <w:sz w:val="28"/>
-          <w:szCs w:val="28"/>
-          <w:lang w:val="en-US" w:bidi="ar-SA"/>
-        </w:rPr>
-        <w:t>b</w:t>
-      </w:r>
-      <w:r>
-        <w:rPr>
-          <w:rFonts w:ascii="Times New Roman" w:eastAsia="Times New Roman" w:hAnsi="Times New Roman" w:cs="Times New Roman"/>
-          <w:sz w:val="28"/>
-          <w:szCs w:val="28"/>
-          <w:lang w:val="en-US" w:bidi="ar-SA"/>
-        </w:rPr>
-        <w:t>etween </w:t>
-      </w:r>
-    </w:p>
-    <w:p>
-      <w:pPr>
-        <w:spacing w:after="0" w:line="240" w:lineRule="auto"/>
-        <w:jc w:val="both"/>
-        <w:rPr>
-          <w:rFonts w:ascii="Times New Roman" w:eastAsia="Times New Roman" w:hAnsi="Times New Roman" w:cs="Times New Roman"/>
-          <w:sz w:val="28"/>
-          <w:szCs w:val="28"/>
-          <w:lang w:val="en-US" w:bidi="ar-SA"/>
-        </w:rPr>
-      </w:pPr>
-    </w:p>
-    <w:p>
-      <w:pPr>
-        <w:spacing w:after="0" w:line="240" w:lineRule="auto"/>
-        <w:ind w:left="270" w:hanging="270"/>
-        <w:jc w:val="both"/>
-        <w:rPr>
-          <w:rFonts w:ascii="Times New Roman" w:eastAsia="Times New Roman" w:hAnsi="Times New Roman" w:cs="Times New Roman"/>
-          <w:b/>
-          <w:sz w:val="28"/>
-          <w:szCs w:val="28"/>
-          <w:lang w:val="en-US" w:bidi="ar-SA"/>
-        </w:rPr>
-      </w:pPr>
-      <w:r>
-        <w:rPr>
-          <w:rFonts w:ascii="Times New Roman" w:eastAsia="Times New Roman" w:hAnsi="Times New Roman" w:cs="Times New Roman"/>
-          <w:b/>
-          <w:sz w:val="28"/>
-          <w:szCs w:val="28"/>
-          <w:lang w:val="en-US" w:bidi="ar-SA"/>
-        </w:rPr>
-        <w:t>7</w:t>
-      </w:r>
-      <w:r>
-        <w:rPr>
-          <w:rFonts w:ascii="Times New Roman" w:eastAsia="Times New Roman" w:hAnsi="Times New Roman" w:cs="Times New Roman"/>
-          <w:b/>
-          <w:sz w:val="28"/>
-          <w:szCs w:val="28"/>
-          <w:lang w:val="en-US" w:bidi="ar-SA"/>
-        </w:rPr>
-        <w:t>)</w:t>
-      </w:r>
-      <w:r>
-        <w:rPr>
-          <w:rFonts w:ascii="Times New Roman" w:eastAsia="Times New Roman" w:hAnsi="Times New Roman" w:cs="Times New Roman"/>
-          <w:b/>
-          <w:sz w:val="28"/>
-          <w:szCs w:val="28"/>
-          <w:lang w:val="en-US" w:bidi="ar-SA"/>
-        </w:rPr>
-        <w:t xml:space="preserve"> </w:t>
-      </w:r>
-      <w:r>
-        <w:rPr>
-          <w:rFonts w:ascii="Times New Roman" w:eastAsia="Times New Roman" w:hAnsi="Times New Roman" w:cs="Times New Roman"/>
-          <w:b/>
-          <w:sz w:val="28"/>
-          <w:szCs w:val="28"/>
-          <w:lang w:val="en-US" w:bidi="ar-SA"/>
-        </w:rPr>
-        <w:t>Develop the following outlines into a story. Al</w:t>
-      </w:r>
-      <w:r>
-        <w:rPr>
-          <w:rFonts w:ascii="Times New Roman" w:eastAsia="Times New Roman" w:hAnsi="Times New Roman" w:cs="Times New Roman"/>
-          <w:b/>
-          <w:sz w:val="28"/>
-          <w:szCs w:val="28"/>
-          <w:lang w:val="en-US" w:bidi="ar-SA"/>
-        </w:rPr>
-        <w:t>so give a suitable title of the story. </w:t>
-      </w:r>
-      <w:r>
-        <w:rPr>
-          <w:rFonts w:ascii="Times New Roman" w:eastAsia="Times New Roman" w:hAnsi="Times New Roman" w:cs="Times New Roman"/>
-          <w:b/>
-          <w:sz w:val="28"/>
-          <w:szCs w:val="28"/>
-          <w:lang w:val="en-US" w:bidi="ar-SA"/>
-        </w:rPr>
-        <w:t xml:space="preserve">                                                       5</w:t>
-      </w:r>
-    </w:p>
-    <w:p>
-      <w:pPr>
-        <w:spacing w:after="0" w:line="240" w:lineRule="auto"/>
-        <w:ind w:left="288"/>
-        <w:jc w:val="both"/>
-        <w:rPr>
-          <w:rFonts w:ascii="Times New Roman" w:eastAsia="Times New Roman" w:hAnsi="Times New Roman" w:cs="Times New Roman"/>
-          <w:sz w:val="28"/>
-          <w:szCs w:val="28"/>
-          <w:lang w:val="en-US" w:bidi="ar-SA"/>
-        </w:rPr>
-      </w:pPr>
-      <w:r>
-        <w:rPr>
-          <w:rFonts w:ascii="Times New Roman" w:eastAsia="Times New Roman" w:hAnsi="Times New Roman" w:cs="Times New Roman"/>
-          <w:sz w:val="28"/>
-          <w:szCs w:val="28"/>
-          <w:lang w:val="en-US" w:bidi="ar-SA"/>
-        </w:rPr>
-        <w:t>A farmer..........three sons........ always quarrelled.......the farmer became sick ..................,.called his sons.................</w:t>
-      </w:r>
-      <w:r>
-        <w:rPr>
-          <w:rFonts w:ascii="Times New Roman" w:eastAsia="Times New Roman" w:hAnsi="Times New Roman" w:cs="Times New Roman"/>
-          <w:sz w:val="28"/>
-          <w:szCs w:val="28"/>
-          <w:lang w:val="en-US" w:bidi="ar-SA"/>
-        </w:rPr>
-        <w:t xml:space="preserve"> </w:t>
-      </w:r>
-      <w:r>
-        <w:rPr>
-          <w:rFonts w:ascii="Times New Roman" w:eastAsia="Times New Roman" w:hAnsi="Times New Roman" w:cs="Times New Roman"/>
-          <w:sz w:val="28"/>
-          <w:szCs w:val="28"/>
-          <w:lang w:val="en-US" w:bidi="ar-SA"/>
-        </w:rPr>
-        <w:t>gave each son a piece of stick to break...</w:t>
-      </w:r>
-      <w:r>
-        <w:rPr>
-          <w:rFonts w:ascii="Times New Roman" w:eastAsia="Times New Roman" w:hAnsi="Times New Roman" w:cs="Times New Roman"/>
-          <w:sz w:val="28"/>
-          <w:szCs w:val="28"/>
-          <w:lang w:val="en-US" w:bidi="ar-SA"/>
-        </w:rPr>
-        <w:t>........</w:t>
-      </w:r>
-      <w:r>
-        <w:rPr>
-          <w:rFonts w:ascii="Times New Roman" w:eastAsia="Times New Roman" w:hAnsi="Times New Roman" w:cs="Times New Roman"/>
-          <w:sz w:val="28"/>
-          <w:szCs w:val="28"/>
-          <w:lang w:val="en-US" w:bidi="ar-SA"/>
-        </w:rPr>
-        <w:t>easily broke......... made the bundle of sticks ..........told them to break ........could not break the bundle....... old father taught them the lesson ..............told them to be united ..........didn't quarrel ............understood the power of unity ......promised their father to stay together</w:t>
-      </w:r>
-      <w:r>
-        <w:rPr>
-          <w:rFonts w:ascii="Times New Roman" w:eastAsia="Times New Roman" w:hAnsi="Times New Roman" w:cs="Times New Roman"/>
-          <w:sz w:val="28"/>
-          <w:szCs w:val="28"/>
-          <w:lang w:val="en-US" w:bidi="ar-SA"/>
-        </w:rPr>
-        <w:t xml:space="preserve"> </w:t>
-      </w:r>
-      <w:r>
-        <w:rPr>
-          <w:rFonts w:ascii="Times New Roman" w:eastAsia="Times New Roman" w:hAnsi="Times New Roman" w:cs="Times New Roman"/>
-          <w:sz w:val="28"/>
-          <w:szCs w:val="28"/>
-          <w:lang w:val="en-US" w:bidi="ar-SA"/>
-        </w:rPr>
-        <w:t>Moral: Unity is strength.</w:t>
-      </w:r>
-    </w:p>
-    <w:p>
-      <w:pPr>
-        <w:spacing w:after="0" w:line="240" w:lineRule="auto"/>
-        <w:jc w:val="both"/>
-        <w:rPr>
-          <w:rFonts w:ascii="Times New Roman" w:eastAsia="Times New Roman" w:hAnsi="Times New Roman" w:cs="Times New Roman"/>
-          <w:sz w:val="28"/>
-          <w:szCs w:val="28"/>
-          <w:lang w:val="en-US" w:bidi="ar-SA"/>
-        </w:rPr>
-      </w:pPr>
-    </w:p>
-    <w:p>
-      <w:pPr>
-        <w:spacing w:after="0" w:line="240" w:lineRule="auto"/>
-        <w:jc w:val="both"/>
-        <w:rPr>
-          <w:rFonts w:ascii="Times New Roman" w:eastAsia="Times New Roman" w:hAnsi="Times New Roman" w:cs="Times New Roman"/>
-          <w:b/>
-          <w:sz w:val="28"/>
-          <w:szCs w:val="28"/>
-          <w:lang w:val="en-US" w:bidi="ar-SA"/>
-        </w:rPr>
-      </w:pPr>
-      <w:r>
-        <w:rPr>
-          <w:rFonts w:ascii="Times New Roman" w:eastAsia="Times New Roman" w:hAnsi="Times New Roman" w:cs="Times New Roman"/>
-          <w:b/>
-          <w:sz w:val="28"/>
-          <w:szCs w:val="28"/>
-          <w:lang w:val="en-US" w:bidi="ar-SA"/>
-        </w:rPr>
-        <w:t>8</w:t>
-      </w:r>
-      <w:r>
-        <w:rPr>
-          <w:rFonts w:ascii="Times New Roman" w:eastAsia="Times New Roman" w:hAnsi="Times New Roman" w:cs="Times New Roman"/>
-          <w:b/>
-          <w:sz w:val="28"/>
-          <w:szCs w:val="28"/>
-          <w:lang w:val="en-US" w:bidi="ar-SA"/>
-        </w:rPr>
-        <w:t>)</w:t>
-      </w:r>
-      <w:r>
-        <w:rPr>
-          <w:rFonts w:ascii="Times New Roman" w:eastAsia="Times New Roman" w:hAnsi="Times New Roman" w:cs="Times New Roman"/>
-          <w:b/>
-          <w:sz w:val="28"/>
-          <w:szCs w:val="28"/>
-          <w:lang w:val="en-US" w:bidi="ar-SA"/>
-        </w:rPr>
-        <w:t xml:space="preserve"> W</w:t>
-      </w:r>
-      <w:r>
-        <w:rPr>
-          <w:rFonts w:ascii="Times New Roman" w:eastAsia="Times New Roman" w:hAnsi="Times New Roman" w:cs="Times New Roman"/>
-          <w:b/>
-          <w:sz w:val="28"/>
-          <w:szCs w:val="28"/>
-          <w:lang w:val="en-US" w:bidi="ar-SA"/>
-        </w:rPr>
-        <w:t>rite a short paragraph about your school</w:t>
-      </w:r>
-      <w:r>
-        <w:rPr>
-          <w:rFonts w:ascii="Times New Roman" w:eastAsia="Times New Roman" w:hAnsi="Times New Roman" w:cs="Times New Roman"/>
-          <w:b/>
-          <w:sz w:val="28"/>
-          <w:szCs w:val="28"/>
-          <w:lang w:val="en-US" w:bidi="ar-SA"/>
-        </w:rPr>
-        <w:t>.</w:t>
-      </w:r>
-      <w:r>
-        <w:rPr>
-          <w:rFonts w:ascii="Times New Roman" w:eastAsia="Times New Roman" w:hAnsi="Times New Roman" w:cs="Times New Roman"/>
-          <w:b/>
-          <w:sz w:val="28"/>
-          <w:szCs w:val="28"/>
-          <w:lang w:val="en-US" w:bidi="ar-SA"/>
-        </w:rPr>
-        <w:t xml:space="preserve">                  5</w:t>
-      </w:r>
-    </w:p>
-    <w:p>
-      <w:pPr>
-        <w:spacing w:after="0" w:line="240" w:lineRule="auto"/>
-        <w:jc w:val="both"/>
-        <w:rPr>
-          <w:rFonts w:ascii="Times New Roman" w:eastAsia="Times New Roman" w:hAnsi="Times New Roman" w:cs="Times New Roman"/>
-          <w:b/>
-          <w:sz w:val="28"/>
-          <w:szCs w:val="28"/>
-          <w:lang w:val="en-US" w:bidi="ar-SA"/>
-        </w:rPr>
-      </w:pPr>
-      <w:r>
-        <w:rPr>
-          <w:rFonts w:ascii="Times New Roman" w:eastAsia="Times New Roman" w:hAnsi="Times New Roman" w:cs="Times New Roman"/>
-          <w:b/>
-          <w:sz w:val="28"/>
-          <w:szCs w:val="28"/>
-          <w:lang w:val="en-US" w:bidi="ar-SA"/>
-        </w:rPr>
-        <w:t>9</w:t>
-      </w:r>
-      <w:r>
-        <w:rPr>
-          <w:rFonts w:ascii="Times New Roman" w:eastAsia="Times New Roman" w:hAnsi="Times New Roman" w:cs="Times New Roman"/>
-          <w:b/>
-          <w:sz w:val="28"/>
-          <w:szCs w:val="28"/>
-          <w:lang w:val="en-US" w:bidi="ar-SA"/>
-        </w:rPr>
-        <w:t>)</w:t>
-      </w:r>
-      <w:r>
-        <w:rPr>
-          <w:rFonts w:ascii="Times New Roman" w:eastAsia="Times New Roman" w:hAnsi="Times New Roman" w:cs="Times New Roman"/>
-          <w:b/>
-          <w:sz w:val="28"/>
-          <w:szCs w:val="28"/>
-          <w:lang w:val="en-US" w:bidi="ar-SA"/>
-        </w:rPr>
         <w:t xml:space="preserve"> Choose the correct answer and fill the blanks.</w:t>
       </w:r>
       <w:r>
@@ -3057,7 +3278,17 @@
           <w:szCs w:val="28"/>
           <w:lang w:val="en-US" w:bidi="ar-SA"/>
         </w:rPr>
-        <w:t xml:space="preserve">              5</w:t>
+        <w:t xml:space="preserve">              </w:t>
+      </w:r>
+      <w:r>
+        <w:rPr>
+          <w:rFonts w:ascii="Times New Roman" w:eastAsia="Times New Roman" w:hAnsi="Times New Roman" w:cs="Times New Roman"/>
+          <w:b/>
+          <w:sz w:val="28"/>
+          <w:szCs w:val="28"/>
+          <w:lang w:val="en-US" w:bidi="ar-SA"/>
+        </w:rPr>
+        <w:t>(5×1=5)</w:t>
       </w:r>
     </w:p>
     <w:p>

</xml_diff>